<commit_message>
backend - updated the backend doc
</commit_message>
<xml_diff>
--- a/Dev docs/Backend Docs.docx
+++ b/Dev docs/Backend Docs.docx
@@ -219,6 +219,28 @@
     </w:p>
     <w:p>
       <w:pPr>
+        <w:pStyle w:val="Listaszerbekezds"/>
+        <w:numPr>
+          <w:ilvl w:val="1"/>
+          <w:numId w:val="1"/>
+        </w:numPr>
+        <w:rPr>
+          <w:rFonts w:ascii="Times New Roman" w:hAnsi="Times New Roman" w:cs="Times New Roman"/>
+          <w:sz w:val="28"/>
+          <w:szCs w:val="28"/>
+        </w:rPr>
+      </w:pPr>
+      <w:r>
+        <w:rPr>
+          <w:rFonts w:ascii="Times New Roman" w:hAnsi="Times New Roman" w:cs="Times New Roman"/>
+          <w:sz w:val="28"/>
+          <w:szCs w:val="28"/>
+        </w:rPr>
+        <w:t>Migration</w:t>
+      </w:r>
+    </w:p>
+    <w:p>
+      <w:pPr>
         <w:rPr>
           <w:rFonts w:ascii="Times New Roman" w:hAnsi="Times New Roman" w:cs="Times New Roman"/>
           <w:sz w:val="28"/>
@@ -380,7 +402,16 @@
           <w:sz w:val="28"/>
           <w:szCs w:val="28"/>
         </w:rPr>
-        <w:t xml:space="preserve">End point: </w:t>
+        <w:t>End</w:t>
+      </w:r>
+      <w:r>
+        <w:rPr>
+          <w:rFonts w:ascii="Times New Roman" w:hAnsi="Times New Roman" w:cs="Times New Roman"/>
+          <w:color w:val="000000" w:themeColor="text1"/>
+          <w:sz w:val="28"/>
+          <w:szCs w:val="28"/>
+        </w:rPr>
+        <w:t xml:space="preserve">point: </w:t>
       </w:r>
       <w:r>
         <w:rPr>
@@ -424,962 +455,1873 @@
         </w:rPr>
         <w:t>Method: POST</w:t>
       </w:r>
+    </w:p>
+    <w:p>
+      <w:pPr>
+        <w:pStyle w:val="Listaszerbekezds"/>
+        <w:numPr>
+          <w:ilvl w:val="1"/>
+          <w:numId w:val="5"/>
+        </w:numPr>
+        <w:rPr>
+          <w:rFonts w:ascii="Times New Roman" w:hAnsi="Times New Roman" w:cs="Times New Roman"/>
+          <w:color w:val="000000" w:themeColor="text1"/>
+          <w:sz w:val="24"/>
+          <w:szCs w:val="24"/>
+        </w:rPr>
+      </w:pPr>
+      <w:r>
+        <w:rPr>
+          <w:rFonts w:ascii="Times New Roman" w:hAnsi="Times New Roman" w:cs="Times New Roman"/>
+          <w:color w:val="000000" w:themeColor="text1"/>
+          <w:sz w:val="28"/>
+          <w:szCs w:val="28"/>
+        </w:rPr>
+        <w:t xml:space="preserve">Response: </w:t>
+      </w:r>
+      <w:proofErr w:type="gramStart"/>
+      <w:r>
+        <w:rPr>
+          <w:rFonts w:ascii="Times New Roman" w:hAnsi="Times New Roman" w:cs="Times New Roman"/>
+          <w:color w:val="000000" w:themeColor="text1"/>
+          <w:sz w:val="28"/>
+          <w:szCs w:val="28"/>
+        </w:rPr>
+        <w:t>Status(</w:t>
+      </w:r>
+      <w:proofErr w:type="gramEnd"/>
+      <w:r>
+        <w:rPr>
+          <w:rFonts w:ascii="Times New Roman" w:hAnsi="Times New Roman" w:cs="Times New Roman"/>
+          <w:color w:val="000000" w:themeColor="text1"/>
+          <w:sz w:val="28"/>
+          <w:szCs w:val="28"/>
+        </w:rPr>
+        <w:t>201</w:t>
+      </w:r>
+      <w:r>
+        <w:rPr>
+          <w:rFonts w:ascii="Times New Roman" w:hAnsi="Times New Roman" w:cs="Times New Roman"/>
+          <w:color w:val="000000" w:themeColor="text1"/>
+          <w:sz w:val="28"/>
+          <w:szCs w:val="28"/>
+        </w:rPr>
+        <w:t>)</w:t>
+      </w:r>
+    </w:p>
+    <w:p>
+      <w:pPr>
+        <w:shd w:val="clear" w:color="auto" w:fill="212121"/>
+        <w:spacing w:line="270" w:lineRule="atLeast"/>
+        <w:rPr>
+          <w:rFonts w:ascii="Courier New" w:eastAsia="Times New Roman" w:hAnsi="Courier New" w:cs="Courier New"/>
+          <w:color w:val="F8F8F2"/>
+          <w:sz w:val="18"/>
+          <w:szCs w:val="18"/>
+        </w:rPr>
+      </w:pPr>
+      <w:r>
+        <w:rPr>
+          <w:rFonts w:ascii="Times New Roman" w:hAnsi="Times New Roman" w:cs="Times New Roman"/>
+          <w:sz w:val="28"/>
+          <w:szCs w:val="28"/>
+        </w:rPr>
+        <w:t>Body:</w:t>
+      </w:r>
+      <w:r>
+        <w:rPr>
+          <w:rFonts w:ascii="Courier New" w:hAnsi="Courier New" w:cs="Courier New"/>
+          <w:color w:val="DCDCDC"/>
+          <w:sz w:val="18"/>
+          <w:szCs w:val="18"/>
+        </w:rPr>
+        <w:t xml:space="preserve"> </w:t>
+      </w:r>
+      <w:r>
+        <w:rPr>
+          <w:rFonts w:ascii="Courier New" w:eastAsia="Times New Roman" w:hAnsi="Courier New" w:cs="Courier New"/>
+          <w:color w:val="DCDCDC"/>
+          <w:sz w:val="18"/>
+          <w:szCs w:val="18"/>
+        </w:rPr>
+        <w:t>{</w:t>
+      </w:r>
+    </w:p>
+    <w:p>
+      <w:pPr>
+        <w:shd w:val="clear" w:color="auto" w:fill="212121"/>
+        <w:spacing w:after="0" w:line="270" w:lineRule="atLeast"/>
+        <w:rPr>
+          <w:rFonts w:ascii="Courier New" w:eastAsia="Times New Roman" w:hAnsi="Courier New" w:cs="Courier New"/>
+          <w:color w:val="F8F8F2"/>
+          <w:sz w:val="18"/>
+          <w:szCs w:val="18"/>
+        </w:rPr>
+      </w:pPr>
+      <w:r>
+        <w:rPr>
+          <w:rFonts w:ascii="Courier New" w:eastAsia="Times New Roman" w:hAnsi="Courier New" w:cs="Courier New"/>
+          <w:color w:val="F8F8F2"/>
+          <w:sz w:val="18"/>
+          <w:szCs w:val="18"/>
+        </w:rPr>
+        <w:t xml:space="preserve">    </w:t>
+      </w:r>
+      <w:r>
+        <w:rPr>
+          <w:rFonts w:ascii="Courier New" w:eastAsia="Times New Roman" w:hAnsi="Courier New" w:cs="Courier New"/>
+          <w:color w:val="9CDCFE"/>
+          <w:sz w:val="18"/>
+          <w:szCs w:val="18"/>
+        </w:rPr>
+        <w:t>"email"</w:t>
+      </w:r>
+      <w:r>
+        <w:rPr>
+          <w:rFonts w:ascii="Courier New" w:eastAsia="Times New Roman" w:hAnsi="Courier New" w:cs="Courier New"/>
+          <w:color w:val="DCDCDC"/>
+          <w:sz w:val="18"/>
+          <w:szCs w:val="18"/>
+        </w:rPr>
+        <w:t>:</w:t>
+      </w:r>
+      <w:r>
+        <w:rPr>
+          <w:rFonts w:ascii="Courier New" w:eastAsia="Times New Roman" w:hAnsi="Courier New" w:cs="Courier New"/>
+          <w:color w:val="F8F8F2"/>
+          <w:sz w:val="18"/>
+          <w:szCs w:val="18"/>
+        </w:rPr>
+        <w:t xml:space="preserve"> </w:t>
+      </w:r>
+      <w:r>
+        <w:rPr>
+          <w:rFonts w:ascii="Courier New" w:eastAsia="Times New Roman" w:hAnsi="Courier New" w:cs="Courier New"/>
+          <w:color w:val="CE9178"/>
+          <w:sz w:val="18"/>
+          <w:szCs w:val="18"/>
+        </w:rPr>
+        <w:t>"vami@gmail.com"</w:t>
+      </w:r>
+      <w:r>
+        <w:rPr>
+          <w:rFonts w:ascii="Courier New" w:eastAsia="Times New Roman" w:hAnsi="Courier New" w:cs="Courier New"/>
+          <w:color w:val="DCDCDC"/>
+          <w:sz w:val="18"/>
+          <w:szCs w:val="18"/>
+        </w:rPr>
+        <w:t>,</w:t>
+      </w:r>
+    </w:p>
+    <w:p>
+      <w:pPr>
+        <w:shd w:val="clear" w:color="auto" w:fill="212121"/>
+        <w:spacing w:after="0" w:line="270" w:lineRule="atLeast"/>
+        <w:rPr>
+          <w:rFonts w:ascii="Courier New" w:eastAsia="Times New Roman" w:hAnsi="Courier New" w:cs="Courier New"/>
+          <w:color w:val="F8F8F2"/>
+          <w:sz w:val="18"/>
+          <w:szCs w:val="18"/>
+        </w:rPr>
+      </w:pPr>
+      <w:r>
+        <w:rPr>
+          <w:rFonts w:ascii="Courier New" w:eastAsia="Times New Roman" w:hAnsi="Courier New" w:cs="Courier New"/>
+          <w:color w:val="F8F8F2"/>
+          <w:sz w:val="18"/>
+          <w:szCs w:val="18"/>
+        </w:rPr>
+        <w:t xml:space="preserve">    </w:t>
+      </w:r>
+      <w:r>
+        <w:rPr>
+          <w:rFonts w:ascii="Courier New" w:eastAsia="Times New Roman" w:hAnsi="Courier New" w:cs="Courier New"/>
+          <w:color w:val="9CDCFE"/>
+          <w:sz w:val="18"/>
+          <w:szCs w:val="18"/>
+        </w:rPr>
+        <w:t>"password"</w:t>
+      </w:r>
+      <w:r>
+        <w:rPr>
+          <w:rFonts w:ascii="Courier New" w:eastAsia="Times New Roman" w:hAnsi="Courier New" w:cs="Courier New"/>
+          <w:color w:val="DCDCDC"/>
+          <w:sz w:val="18"/>
+          <w:szCs w:val="18"/>
+        </w:rPr>
+        <w:t>:</w:t>
+      </w:r>
+      <w:r>
+        <w:rPr>
+          <w:rFonts w:ascii="Courier New" w:eastAsia="Times New Roman" w:hAnsi="Courier New" w:cs="Courier New"/>
+          <w:color w:val="F8F8F2"/>
+          <w:sz w:val="18"/>
+          <w:szCs w:val="18"/>
+        </w:rPr>
+        <w:t xml:space="preserve"> </w:t>
+      </w:r>
+      <w:r>
+        <w:rPr>
+          <w:rFonts w:ascii="Courier New" w:eastAsia="Times New Roman" w:hAnsi="Courier New" w:cs="Courier New"/>
+          <w:color w:val="CE9178"/>
+          <w:sz w:val="18"/>
+          <w:szCs w:val="18"/>
+        </w:rPr>
+        <w:t>"myPass@001"</w:t>
+      </w:r>
+      <w:r>
+        <w:rPr>
+          <w:rFonts w:ascii="Courier New" w:eastAsia="Times New Roman" w:hAnsi="Courier New" w:cs="Courier New"/>
+          <w:color w:val="DCDCDC"/>
+          <w:sz w:val="18"/>
+          <w:szCs w:val="18"/>
+        </w:rPr>
+        <w:t>,</w:t>
+      </w:r>
+    </w:p>
+    <w:p>
+      <w:pPr>
+        <w:shd w:val="clear" w:color="auto" w:fill="212121"/>
+        <w:spacing w:after="0" w:line="270" w:lineRule="atLeast"/>
+        <w:rPr>
+          <w:rFonts w:ascii="Courier New" w:eastAsia="Times New Roman" w:hAnsi="Courier New" w:cs="Courier New"/>
+          <w:color w:val="F8F8F2"/>
+          <w:sz w:val="18"/>
+          <w:szCs w:val="18"/>
+        </w:rPr>
+      </w:pPr>
+      <w:r>
+        <w:rPr>
+          <w:rFonts w:ascii="Courier New" w:eastAsia="Times New Roman" w:hAnsi="Courier New" w:cs="Courier New"/>
+          <w:color w:val="F8F8F2"/>
+          <w:sz w:val="18"/>
+          <w:szCs w:val="18"/>
+        </w:rPr>
+        <w:t xml:space="preserve">    </w:t>
+      </w:r>
+      <w:r>
+        <w:rPr>
+          <w:rFonts w:ascii="Courier New" w:eastAsia="Times New Roman" w:hAnsi="Courier New" w:cs="Courier New"/>
+          <w:color w:val="9CDCFE"/>
+          <w:sz w:val="18"/>
+          <w:szCs w:val="18"/>
+        </w:rPr>
+        <w:t>"role"</w:t>
+      </w:r>
+      <w:r>
+        <w:rPr>
+          <w:rFonts w:ascii="Courier New" w:eastAsia="Times New Roman" w:hAnsi="Courier New" w:cs="Courier New"/>
+          <w:color w:val="DCDCDC"/>
+          <w:sz w:val="18"/>
+          <w:szCs w:val="18"/>
+        </w:rPr>
+        <w:t>:</w:t>
+      </w:r>
+      <w:r>
+        <w:rPr>
+          <w:rFonts w:ascii="Courier New" w:eastAsia="Times New Roman" w:hAnsi="Courier New" w:cs="Courier New"/>
+          <w:color w:val="F8F8F2"/>
+          <w:sz w:val="18"/>
+          <w:szCs w:val="18"/>
+        </w:rPr>
+        <w:t xml:space="preserve"> </w:t>
+      </w:r>
+      <w:r>
+        <w:rPr>
+          <w:rFonts w:ascii="Courier New" w:eastAsia="Times New Roman" w:hAnsi="Courier New" w:cs="Courier New"/>
+          <w:color w:val="CE9178"/>
+          <w:sz w:val="18"/>
+          <w:szCs w:val="18"/>
+        </w:rPr>
+        <w:t>"teacher"</w:t>
+      </w:r>
+      <w:r>
+        <w:rPr>
+          <w:rFonts w:ascii="Courier New" w:eastAsia="Times New Roman" w:hAnsi="Courier New" w:cs="Courier New"/>
+          <w:color w:val="DCDCDC"/>
+          <w:sz w:val="18"/>
+          <w:szCs w:val="18"/>
+        </w:rPr>
+        <w:t>,</w:t>
+      </w:r>
+    </w:p>
+    <w:p>
+      <w:pPr>
+        <w:shd w:val="clear" w:color="auto" w:fill="212121"/>
+        <w:spacing w:after="0" w:line="270" w:lineRule="atLeast"/>
+        <w:rPr>
+          <w:rFonts w:ascii="Courier New" w:eastAsia="Times New Roman" w:hAnsi="Courier New" w:cs="Courier New"/>
+          <w:color w:val="F8F8F2"/>
+          <w:sz w:val="18"/>
+          <w:szCs w:val="18"/>
+        </w:rPr>
+      </w:pPr>
+      <w:r>
+        <w:rPr>
+          <w:rFonts w:ascii="Courier New" w:eastAsia="Times New Roman" w:hAnsi="Courier New" w:cs="Courier New"/>
+          <w:color w:val="F8F8F2"/>
+          <w:sz w:val="18"/>
+          <w:szCs w:val="18"/>
+        </w:rPr>
+        <w:t xml:space="preserve">    </w:t>
+      </w:r>
+      <w:r>
+        <w:rPr>
+          <w:rFonts w:ascii="Courier New" w:eastAsia="Times New Roman" w:hAnsi="Courier New" w:cs="Courier New"/>
+          <w:color w:val="9CDCFE"/>
+          <w:sz w:val="18"/>
+          <w:szCs w:val="18"/>
+        </w:rPr>
+        <w:t>"nickname"</w:t>
+      </w:r>
+      <w:r>
+        <w:rPr>
+          <w:rFonts w:ascii="Courier New" w:eastAsia="Times New Roman" w:hAnsi="Courier New" w:cs="Courier New"/>
+          <w:color w:val="DCDCDC"/>
+          <w:sz w:val="18"/>
+          <w:szCs w:val="18"/>
+        </w:rPr>
+        <w:t>:</w:t>
+      </w:r>
+      <w:r>
+        <w:rPr>
+          <w:rFonts w:ascii="Courier New" w:eastAsia="Times New Roman" w:hAnsi="Courier New" w:cs="Courier New"/>
+          <w:color w:val="F8F8F2"/>
+          <w:sz w:val="18"/>
+          <w:szCs w:val="18"/>
+        </w:rPr>
+        <w:t xml:space="preserve"> </w:t>
+      </w:r>
+      <w:r>
+        <w:rPr>
+          <w:rFonts w:ascii="Courier New" w:eastAsia="Times New Roman" w:hAnsi="Courier New" w:cs="Courier New"/>
+          <w:color w:val="CE9178"/>
+          <w:sz w:val="18"/>
+          <w:szCs w:val="18"/>
+        </w:rPr>
+        <w:t>"</w:t>
+      </w:r>
+      <w:proofErr w:type="spellStart"/>
+      <w:r>
+        <w:rPr>
+          <w:rFonts w:ascii="Courier New" w:eastAsia="Times New Roman" w:hAnsi="Courier New" w:cs="Courier New"/>
+          <w:color w:val="CE9178"/>
+          <w:sz w:val="18"/>
+          <w:szCs w:val="18"/>
+        </w:rPr>
+        <w:t>vami</w:t>
+      </w:r>
+      <w:proofErr w:type="spellEnd"/>
+      <w:r>
+        <w:rPr>
+          <w:rFonts w:ascii="Courier New" w:eastAsia="Times New Roman" w:hAnsi="Courier New" w:cs="Courier New"/>
+          <w:color w:val="CE9178"/>
+          <w:sz w:val="18"/>
+          <w:szCs w:val="18"/>
+        </w:rPr>
+        <w:t>"</w:t>
+      </w:r>
+      <w:r>
+        <w:rPr>
+          <w:rFonts w:ascii="Courier New" w:eastAsia="Times New Roman" w:hAnsi="Courier New" w:cs="Courier New"/>
+          <w:color w:val="DCDCDC"/>
+          <w:sz w:val="18"/>
+          <w:szCs w:val="18"/>
+        </w:rPr>
+        <w:t>,</w:t>
+      </w:r>
+    </w:p>
+    <w:p>
+      <w:pPr>
+        <w:shd w:val="clear" w:color="auto" w:fill="212121"/>
+        <w:spacing w:after="0" w:line="270" w:lineRule="atLeast"/>
+        <w:rPr>
+          <w:rFonts w:ascii="Courier New" w:eastAsia="Times New Roman" w:hAnsi="Courier New" w:cs="Courier New"/>
+          <w:color w:val="F8F8F2"/>
+          <w:sz w:val="18"/>
+          <w:szCs w:val="18"/>
+        </w:rPr>
+      </w:pPr>
+      <w:r>
+        <w:rPr>
+          <w:rFonts w:ascii="Courier New" w:eastAsia="Times New Roman" w:hAnsi="Courier New" w:cs="Courier New"/>
+          <w:color w:val="F8F8F2"/>
+          <w:sz w:val="18"/>
+          <w:szCs w:val="18"/>
+        </w:rPr>
+        <w:t xml:space="preserve">    </w:t>
+      </w:r>
+      <w:r>
+        <w:rPr>
+          <w:rFonts w:ascii="Courier New" w:eastAsia="Times New Roman" w:hAnsi="Courier New" w:cs="Courier New"/>
+          <w:color w:val="9CDCFE"/>
+          <w:sz w:val="18"/>
+          <w:szCs w:val="18"/>
+        </w:rPr>
+        <w:t>"address"</w:t>
+      </w:r>
+      <w:r>
+        <w:rPr>
+          <w:rFonts w:ascii="Courier New" w:eastAsia="Times New Roman" w:hAnsi="Courier New" w:cs="Courier New"/>
+          <w:color w:val="DCDCDC"/>
+          <w:sz w:val="18"/>
+          <w:szCs w:val="18"/>
+        </w:rPr>
+        <w:t>:</w:t>
+      </w:r>
+      <w:r>
+        <w:rPr>
+          <w:rFonts w:ascii="Courier New" w:eastAsia="Times New Roman" w:hAnsi="Courier New" w:cs="Courier New"/>
+          <w:color w:val="F8F8F2"/>
+          <w:sz w:val="18"/>
+          <w:szCs w:val="18"/>
+        </w:rPr>
+        <w:t xml:space="preserve"> </w:t>
+      </w:r>
+      <w:r>
+        <w:rPr>
+          <w:rFonts w:ascii="Courier New" w:eastAsia="Times New Roman" w:hAnsi="Courier New" w:cs="Courier New"/>
+          <w:color w:val="CE9178"/>
+          <w:sz w:val="18"/>
+          <w:szCs w:val="18"/>
+        </w:rPr>
+        <w:t>"home"</w:t>
+      </w:r>
+      <w:r>
+        <w:rPr>
+          <w:rFonts w:ascii="Courier New" w:eastAsia="Times New Roman" w:hAnsi="Courier New" w:cs="Courier New"/>
+          <w:color w:val="DCDCDC"/>
+          <w:sz w:val="18"/>
+          <w:szCs w:val="18"/>
+        </w:rPr>
+        <w:t>,</w:t>
+      </w:r>
+    </w:p>
+    <w:p>
+      <w:pPr>
+        <w:shd w:val="clear" w:color="auto" w:fill="212121"/>
+        <w:spacing w:after="0" w:line="270" w:lineRule="atLeast"/>
+        <w:rPr>
+          <w:rFonts w:ascii="Courier New" w:eastAsia="Times New Roman" w:hAnsi="Courier New" w:cs="Courier New"/>
+          <w:color w:val="F8F8F2"/>
+          <w:sz w:val="18"/>
+          <w:szCs w:val="18"/>
+        </w:rPr>
+      </w:pPr>
+      <w:r>
+        <w:rPr>
+          <w:rFonts w:ascii="Courier New" w:eastAsia="Times New Roman" w:hAnsi="Courier New" w:cs="Courier New"/>
+          <w:color w:val="F8F8F2"/>
+          <w:sz w:val="18"/>
+          <w:szCs w:val="18"/>
+        </w:rPr>
+        <w:t xml:space="preserve">    </w:t>
+      </w:r>
+      <w:r>
+        <w:rPr>
+          <w:rFonts w:ascii="Courier New" w:eastAsia="Times New Roman" w:hAnsi="Courier New" w:cs="Courier New"/>
+          <w:color w:val="9CDCFE"/>
+          <w:sz w:val="18"/>
+          <w:szCs w:val="18"/>
+        </w:rPr>
+        <w:t>"</w:t>
+      </w:r>
+      <w:proofErr w:type="spellStart"/>
+      <w:r>
+        <w:rPr>
+          <w:rFonts w:ascii="Courier New" w:eastAsia="Times New Roman" w:hAnsi="Courier New" w:cs="Courier New"/>
+          <w:color w:val="9CDCFE"/>
+          <w:sz w:val="18"/>
+          <w:szCs w:val="18"/>
+        </w:rPr>
+        <w:t>date_of_birth</w:t>
+      </w:r>
+      <w:proofErr w:type="spellEnd"/>
+      <w:r>
+        <w:rPr>
+          <w:rFonts w:ascii="Courier New" w:eastAsia="Times New Roman" w:hAnsi="Courier New" w:cs="Courier New"/>
+          <w:color w:val="9CDCFE"/>
+          <w:sz w:val="18"/>
+          <w:szCs w:val="18"/>
+        </w:rPr>
+        <w:t>"</w:t>
+      </w:r>
+      <w:r>
+        <w:rPr>
+          <w:rFonts w:ascii="Courier New" w:eastAsia="Times New Roman" w:hAnsi="Courier New" w:cs="Courier New"/>
+          <w:color w:val="DCDCDC"/>
+          <w:sz w:val="18"/>
+          <w:szCs w:val="18"/>
+        </w:rPr>
+        <w:t>:</w:t>
+      </w:r>
+      <w:r>
+        <w:rPr>
+          <w:rFonts w:ascii="Courier New" w:eastAsia="Times New Roman" w:hAnsi="Courier New" w:cs="Courier New"/>
+          <w:color w:val="F8F8F2"/>
+          <w:sz w:val="18"/>
+          <w:szCs w:val="18"/>
+        </w:rPr>
+        <w:t xml:space="preserve"> </w:t>
+      </w:r>
+      <w:r>
+        <w:rPr>
+          <w:rFonts w:ascii="Courier New" w:eastAsia="Times New Roman" w:hAnsi="Courier New" w:cs="Courier New"/>
+          <w:color w:val="CE9178"/>
+          <w:sz w:val="18"/>
+          <w:szCs w:val="18"/>
+        </w:rPr>
+        <w:t>"2000-01-01"</w:t>
+      </w:r>
+      <w:r>
+        <w:rPr>
+          <w:rFonts w:ascii="Courier New" w:eastAsia="Times New Roman" w:hAnsi="Courier New" w:cs="Courier New"/>
+          <w:color w:val="DCDCDC"/>
+          <w:sz w:val="18"/>
+          <w:szCs w:val="18"/>
+        </w:rPr>
+        <w:t>,</w:t>
+      </w:r>
+    </w:p>
+    <w:p>
+      <w:pPr>
+        <w:shd w:val="clear" w:color="auto" w:fill="212121"/>
+        <w:spacing w:after="0" w:line="270" w:lineRule="atLeast"/>
+        <w:rPr>
+          <w:rFonts w:ascii="Courier New" w:eastAsia="Times New Roman" w:hAnsi="Courier New" w:cs="Courier New"/>
+          <w:color w:val="F8F8F2"/>
+          <w:sz w:val="18"/>
+          <w:szCs w:val="18"/>
+        </w:rPr>
+      </w:pPr>
+      <w:r>
+        <w:rPr>
+          <w:rFonts w:ascii="Courier New" w:eastAsia="Times New Roman" w:hAnsi="Courier New" w:cs="Courier New"/>
+          <w:color w:val="F8F8F2"/>
+          <w:sz w:val="18"/>
+          <w:szCs w:val="18"/>
+        </w:rPr>
+        <w:t xml:space="preserve">    </w:t>
+      </w:r>
+      <w:r>
+        <w:rPr>
+          <w:rFonts w:ascii="Courier New" w:eastAsia="Times New Roman" w:hAnsi="Courier New" w:cs="Courier New"/>
+          <w:color w:val="9CDCFE"/>
+          <w:sz w:val="18"/>
+          <w:szCs w:val="18"/>
+        </w:rPr>
+        <w:t>"full_name"</w:t>
+      </w:r>
+      <w:r>
+        <w:rPr>
+          <w:rFonts w:ascii="Courier New" w:eastAsia="Times New Roman" w:hAnsi="Courier New" w:cs="Courier New"/>
+          <w:color w:val="DCDCDC"/>
+          <w:sz w:val="18"/>
+          <w:szCs w:val="18"/>
+        </w:rPr>
+        <w:t>:</w:t>
+      </w:r>
+      <w:r>
+        <w:rPr>
+          <w:rFonts w:ascii="Courier New" w:eastAsia="Times New Roman" w:hAnsi="Courier New" w:cs="Courier New"/>
+          <w:color w:val="CE9178"/>
+          <w:sz w:val="18"/>
+          <w:szCs w:val="18"/>
+        </w:rPr>
+        <w:t>"</w:t>
+      </w:r>
+      <w:proofErr w:type="spellStart"/>
+      <w:r>
+        <w:rPr>
+          <w:rFonts w:ascii="Courier New" w:eastAsia="Times New Roman" w:hAnsi="Courier New" w:cs="Courier New"/>
+          <w:color w:val="CE9178"/>
+          <w:sz w:val="18"/>
+          <w:szCs w:val="18"/>
+        </w:rPr>
+        <w:t>Vami</w:t>
+      </w:r>
+      <w:proofErr w:type="spellEnd"/>
+      <w:r>
+        <w:rPr>
+          <w:rFonts w:ascii="Courier New" w:eastAsia="Times New Roman" w:hAnsi="Courier New" w:cs="Courier New"/>
+          <w:color w:val="CE9178"/>
+          <w:sz w:val="18"/>
+          <w:szCs w:val="18"/>
+        </w:rPr>
+        <w:t xml:space="preserve"> </w:t>
+      </w:r>
+      <w:proofErr w:type="spellStart"/>
+      <w:r>
+        <w:rPr>
+          <w:rFonts w:ascii="Courier New" w:eastAsia="Times New Roman" w:hAnsi="Courier New" w:cs="Courier New"/>
+          <w:color w:val="CE9178"/>
+          <w:sz w:val="18"/>
+          <w:szCs w:val="18"/>
+        </w:rPr>
+        <w:t>vami</w:t>
+      </w:r>
+      <w:proofErr w:type="spellEnd"/>
+      <w:r>
+        <w:rPr>
+          <w:rFonts w:ascii="Courier New" w:eastAsia="Times New Roman" w:hAnsi="Courier New" w:cs="Courier New"/>
+          <w:color w:val="CE9178"/>
+          <w:sz w:val="18"/>
+          <w:szCs w:val="18"/>
+        </w:rPr>
+        <w:t>"</w:t>
+      </w:r>
+    </w:p>
+    <w:p>
+      <w:pPr>
+        <w:shd w:val="clear" w:color="auto" w:fill="212121"/>
+        <w:spacing w:after="0" w:line="270" w:lineRule="atLeast"/>
+        <w:rPr>
+          <w:rFonts w:ascii="Courier New" w:eastAsia="Times New Roman" w:hAnsi="Courier New" w:cs="Courier New"/>
+          <w:color w:val="F8F8F2"/>
+          <w:sz w:val="18"/>
+          <w:szCs w:val="18"/>
+        </w:rPr>
+      </w:pPr>
+      <w:r>
+        <w:rPr>
+          <w:rFonts w:ascii="Courier New" w:eastAsia="Times New Roman" w:hAnsi="Courier New" w:cs="Courier New"/>
+          <w:color w:val="DCDCDC"/>
+          <w:sz w:val="18"/>
+          <w:szCs w:val="18"/>
+        </w:rPr>
+        <w:t>}</w:t>
+      </w:r>
+    </w:p>
+    <w:p>
+      <w:pPr>
+        <w:pStyle w:val="Listaszerbekezds"/>
+        <w:numPr>
+          <w:ilvl w:val="0"/>
+          <w:numId w:val="5"/>
+        </w:numPr>
+        <w:rPr>
+          <w:rFonts w:ascii="Times New Roman" w:hAnsi="Times New Roman" w:cs="Times New Roman"/>
+          <w:color w:val="FF0000"/>
+          <w:sz w:val="28"/>
+          <w:szCs w:val="28"/>
+        </w:rPr>
+      </w:pPr>
+      <w:r>
+        <w:rPr>
+          <w:rFonts w:ascii="Times New Roman" w:hAnsi="Times New Roman" w:cs="Times New Roman"/>
+          <w:sz w:val="28"/>
+          <w:szCs w:val="28"/>
+        </w:rPr>
+        <w:t>Login:</w:t>
+      </w:r>
+    </w:p>
+    <w:p>
+      <w:pPr>
+        <w:pStyle w:val="Listaszerbekezds"/>
+        <w:numPr>
+          <w:ilvl w:val="1"/>
+          <w:numId w:val="5"/>
+        </w:numPr>
+        <w:rPr>
+          <w:rFonts w:ascii="Times New Roman" w:hAnsi="Times New Roman" w:cs="Times New Roman"/>
+          <w:color w:val="FF0000"/>
+          <w:sz w:val="28"/>
+          <w:szCs w:val="28"/>
+        </w:rPr>
+      </w:pPr>
+      <w:r>
+        <w:rPr>
+          <w:rFonts w:ascii="Times New Roman" w:hAnsi="Times New Roman" w:cs="Times New Roman"/>
+          <w:sz w:val="28"/>
+          <w:szCs w:val="28"/>
+        </w:rPr>
+        <w:t>End</w:t>
+      </w:r>
+      <w:r>
+        <w:rPr>
+          <w:rFonts w:ascii="Times New Roman" w:hAnsi="Times New Roman" w:cs="Times New Roman"/>
+          <w:sz w:val="28"/>
+          <w:szCs w:val="28"/>
+        </w:rPr>
+        <w:t>point: /login</w:t>
+      </w:r>
+    </w:p>
+    <w:p>
+      <w:pPr>
+        <w:pStyle w:val="Listaszerbekezds"/>
+        <w:numPr>
+          <w:ilvl w:val="1"/>
+          <w:numId w:val="5"/>
+        </w:numPr>
+        <w:rPr>
+          <w:rFonts w:ascii="Times New Roman" w:hAnsi="Times New Roman" w:cs="Times New Roman"/>
+          <w:color w:val="FF0000"/>
+          <w:sz w:val="28"/>
+          <w:szCs w:val="28"/>
+        </w:rPr>
+      </w:pPr>
+      <w:r>
+        <w:rPr>
+          <w:rFonts w:ascii="Times New Roman" w:hAnsi="Times New Roman" w:cs="Times New Roman"/>
+          <w:sz w:val="28"/>
+          <w:szCs w:val="28"/>
+        </w:rPr>
+        <w:t>Method: POST</w:t>
+      </w:r>
+    </w:p>
+    <w:p>
+      <w:pPr>
+        <w:pStyle w:val="Listaszerbekezds"/>
+        <w:numPr>
+          <w:ilvl w:val="1"/>
+          <w:numId w:val="5"/>
+        </w:numPr>
+        <w:rPr>
+          <w:rFonts w:ascii="Times New Roman" w:hAnsi="Times New Roman" w:cs="Times New Roman"/>
+          <w:color w:val="000000" w:themeColor="text1"/>
+          <w:sz w:val="24"/>
+          <w:szCs w:val="24"/>
+        </w:rPr>
+      </w:pPr>
+      <w:r>
+        <w:rPr>
+          <w:rFonts w:ascii="Times New Roman" w:hAnsi="Times New Roman" w:cs="Times New Roman"/>
+          <w:color w:val="000000" w:themeColor="text1"/>
+          <w:sz w:val="28"/>
+          <w:szCs w:val="28"/>
+        </w:rPr>
+        <w:t xml:space="preserve">Response: </w:t>
+      </w:r>
+      <w:proofErr w:type="gramStart"/>
+      <w:r>
+        <w:rPr>
+          <w:rFonts w:ascii="Times New Roman" w:hAnsi="Times New Roman" w:cs="Times New Roman"/>
+          <w:color w:val="000000" w:themeColor="text1"/>
+          <w:sz w:val="28"/>
+          <w:szCs w:val="28"/>
+        </w:rPr>
+        <w:t>Status(</w:t>
+      </w:r>
+      <w:proofErr w:type="gramEnd"/>
+      <w:r>
+        <w:rPr>
+          <w:rFonts w:ascii="Times New Roman" w:hAnsi="Times New Roman" w:cs="Times New Roman"/>
+          <w:color w:val="000000" w:themeColor="text1"/>
+          <w:sz w:val="28"/>
+          <w:szCs w:val="28"/>
+        </w:rPr>
+        <w:t>200)</w:t>
+      </w:r>
+    </w:p>
+    <w:p>
+      <w:pPr>
+        <w:shd w:val="clear" w:color="auto" w:fill="212121"/>
+        <w:spacing w:line="270" w:lineRule="atLeast"/>
+        <w:rPr>
+          <w:rFonts w:ascii="Courier New" w:eastAsia="Times New Roman" w:hAnsi="Courier New" w:cs="Courier New"/>
+          <w:color w:val="F8F8F2"/>
+          <w:sz w:val="18"/>
+          <w:szCs w:val="18"/>
+        </w:rPr>
+      </w:pPr>
+      <w:r>
+        <w:rPr>
+          <w:rFonts w:ascii="Times New Roman" w:hAnsi="Times New Roman" w:cs="Times New Roman"/>
+          <w:sz w:val="28"/>
+          <w:szCs w:val="28"/>
+        </w:rPr>
+        <w:t>Body.</w:t>
+      </w:r>
+      <w:r>
+        <w:rPr>
+          <w:rFonts w:ascii="Courier New" w:hAnsi="Courier New" w:cs="Courier New"/>
+          <w:color w:val="DCDCDC"/>
+          <w:sz w:val="18"/>
+          <w:szCs w:val="18"/>
+        </w:rPr>
+        <w:t xml:space="preserve"> </w:t>
+      </w:r>
+      <w:r>
+        <w:rPr>
+          <w:rFonts w:ascii="Courier New" w:eastAsia="Times New Roman" w:hAnsi="Courier New" w:cs="Courier New"/>
+          <w:color w:val="DCDCDC"/>
+          <w:sz w:val="18"/>
+          <w:szCs w:val="18"/>
+        </w:rPr>
+        <w:t>{</w:t>
+      </w:r>
+    </w:p>
+    <w:p>
+      <w:pPr>
+        <w:shd w:val="clear" w:color="auto" w:fill="212121"/>
+        <w:spacing w:after="0" w:line="270" w:lineRule="atLeast"/>
+        <w:rPr>
+          <w:rFonts w:ascii="Courier New" w:eastAsia="Times New Roman" w:hAnsi="Courier New" w:cs="Courier New"/>
+          <w:color w:val="F8F8F2"/>
+          <w:sz w:val="18"/>
+          <w:szCs w:val="18"/>
+        </w:rPr>
+      </w:pPr>
+      <w:r>
+        <w:rPr>
+          <w:rFonts w:ascii="Courier New" w:eastAsia="Times New Roman" w:hAnsi="Courier New" w:cs="Courier New"/>
+          <w:color w:val="F8F8F2"/>
+          <w:sz w:val="18"/>
+          <w:szCs w:val="18"/>
+        </w:rPr>
+        <w:t xml:space="preserve">    </w:t>
+      </w:r>
+      <w:r>
+        <w:rPr>
+          <w:rFonts w:ascii="Courier New" w:eastAsia="Times New Roman" w:hAnsi="Courier New" w:cs="Courier New"/>
+          <w:color w:val="9CDCFE"/>
+          <w:sz w:val="18"/>
+          <w:szCs w:val="18"/>
+        </w:rPr>
+        <w:t>"email"</w:t>
+      </w:r>
+      <w:r>
+        <w:rPr>
+          <w:rFonts w:ascii="Courier New" w:eastAsia="Times New Roman" w:hAnsi="Courier New" w:cs="Courier New"/>
+          <w:color w:val="DCDCDC"/>
+          <w:sz w:val="18"/>
+          <w:szCs w:val="18"/>
+        </w:rPr>
+        <w:t>:</w:t>
+      </w:r>
+      <w:r>
+        <w:rPr>
+          <w:rFonts w:ascii="Courier New" w:eastAsia="Times New Roman" w:hAnsi="Courier New" w:cs="Courier New"/>
+          <w:color w:val="CE9178"/>
+          <w:sz w:val="18"/>
+          <w:szCs w:val="18"/>
+        </w:rPr>
+        <w:t>"vami@gmail.com"</w:t>
+      </w:r>
+      <w:r>
+        <w:rPr>
+          <w:rFonts w:ascii="Courier New" w:eastAsia="Times New Roman" w:hAnsi="Courier New" w:cs="Courier New"/>
+          <w:color w:val="DCDCDC"/>
+          <w:sz w:val="18"/>
+          <w:szCs w:val="18"/>
+        </w:rPr>
+        <w:t>,</w:t>
+      </w:r>
+    </w:p>
+    <w:p>
+      <w:pPr>
+        <w:shd w:val="clear" w:color="auto" w:fill="212121"/>
+        <w:spacing w:after="0" w:line="270" w:lineRule="atLeast"/>
+        <w:rPr>
+          <w:rFonts w:ascii="Courier New" w:eastAsia="Times New Roman" w:hAnsi="Courier New" w:cs="Courier New"/>
+          <w:color w:val="F8F8F2"/>
+          <w:sz w:val="18"/>
+          <w:szCs w:val="18"/>
+        </w:rPr>
+      </w:pPr>
+      <w:r>
+        <w:rPr>
+          <w:rFonts w:ascii="Courier New" w:eastAsia="Times New Roman" w:hAnsi="Courier New" w:cs="Courier New"/>
+          <w:color w:val="F8F8F2"/>
+          <w:sz w:val="18"/>
+          <w:szCs w:val="18"/>
+        </w:rPr>
+        <w:t xml:space="preserve">    </w:t>
+      </w:r>
+      <w:r>
+        <w:rPr>
+          <w:rFonts w:ascii="Courier New" w:eastAsia="Times New Roman" w:hAnsi="Courier New" w:cs="Courier New"/>
+          <w:color w:val="9CDCFE"/>
+          <w:sz w:val="18"/>
+          <w:szCs w:val="18"/>
+        </w:rPr>
+        <w:t>"password"</w:t>
+      </w:r>
+      <w:r>
+        <w:rPr>
+          <w:rFonts w:ascii="Courier New" w:eastAsia="Times New Roman" w:hAnsi="Courier New" w:cs="Courier New"/>
+          <w:color w:val="DCDCDC"/>
+          <w:sz w:val="18"/>
+          <w:szCs w:val="18"/>
+        </w:rPr>
+        <w:t>:</w:t>
+      </w:r>
+      <w:r>
+        <w:rPr>
+          <w:rFonts w:ascii="Courier New" w:eastAsia="Times New Roman" w:hAnsi="Courier New" w:cs="Courier New"/>
+          <w:color w:val="CE9178"/>
+          <w:sz w:val="18"/>
+          <w:szCs w:val="18"/>
+        </w:rPr>
+        <w:t>"myPass@001"</w:t>
+      </w:r>
+    </w:p>
+    <w:p>
+      <w:pPr>
+        <w:shd w:val="clear" w:color="auto" w:fill="212121"/>
+        <w:spacing w:after="0" w:line="270" w:lineRule="atLeast"/>
+        <w:rPr>
+          <w:rFonts w:ascii="Courier New" w:eastAsia="Times New Roman" w:hAnsi="Courier New" w:cs="Courier New"/>
+          <w:color w:val="F8F8F2"/>
+          <w:sz w:val="18"/>
+          <w:szCs w:val="18"/>
+        </w:rPr>
+      </w:pPr>
+      <w:r>
+        <w:rPr>
+          <w:rFonts w:ascii="Courier New" w:eastAsia="Times New Roman" w:hAnsi="Courier New" w:cs="Courier New"/>
+          <w:color w:val="DCDCDC"/>
+          <w:sz w:val="18"/>
+          <w:szCs w:val="18"/>
+        </w:rPr>
+        <w:t>}</w:t>
+      </w:r>
+    </w:p>
+    <w:p>
+      <w:pPr>
+        <w:pStyle w:val="Listaszerbekezds"/>
+        <w:numPr>
+          <w:ilvl w:val="0"/>
+          <w:numId w:val="5"/>
+        </w:numPr>
+        <w:rPr>
+          <w:rFonts w:ascii="Times New Roman" w:hAnsi="Times New Roman" w:cs="Times New Roman"/>
+          <w:color w:val="FF0000"/>
+          <w:sz w:val="28"/>
+          <w:szCs w:val="28"/>
+        </w:rPr>
+      </w:pPr>
+      <w:r>
+        <w:rPr>
+          <w:rFonts w:ascii="Times New Roman" w:hAnsi="Times New Roman" w:cs="Times New Roman"/>
+          <w:sz w:val="28"/>
+          <w:szCs w:val="28"/>
+        </w:rPr>
+        <w:t>Refresh:</w:t>
+      </w:r>
+    </w:p>
+    <w:p>
+      <w:pPr>
+        <w:pStyle w:val="Listaszerbekezds"/>
+        <w:numPr>
+          <w:ilvl w:val="1"/>
+          <w:numId w:val="5"/>
+        </w:numPr>
+        <w:rPr>
+          <w:rFonts w:ascii="Times New Roman" w:hAnsi="Times New Roman" w:cs="Times New Roman"/>
+          <w:color w:val="FF0000"/>
+          <w:sz w:val="28"/>
+          <w:szCs w:val="28"/>
+        </w:rPr>
+      </w:pPr>
+      <w:r>
+        <w:rPr>
+          <w:rFonts w:ascii="Times New Roman" w:hAnsi="Times New Roman" w:cs="Times New Roman"/>
+          <w:sz w:val="28"/>
+          <w:szCs w:val="28"/>
+        </w:rPr>
+        <w:t>End</w:t>
+      </w:r>
+      <w:r>
+        <w:rPr>
+          <w:rFonts w:ascii="Times New Roman" w:hAnsi="Times New Roman" w:cs="Times New Roman"/>
+          <w:sz w:val="28"/>
+          <w:szCs w:val="28"/>
+        </w:rPr>
+        <w:t>point: /refresh</w:t>
+      </w:r>
+    </w:p>
+    <w:p>
+      <w:pPr>
+        <w:pStyle w:val="Listaszerbekezds"/>
+        <w:numPr>
+          <w:ilvl w:val="1"/>
+          <w:numId w:val="5"/>
+        </w:numPr>
+        <w:rPr>
+          <w:rFonts w:ascii="Times New Roman" w:hAnsi="Times New Roman" w:cs="Times New Roman"/>
+          <w:color w:val="FF0000"/>
+          <w:sz w:val="28"/>
+          <w:szCs w:val="28"/>
+        </w:rPr>
+      </w:pPr>
+      <w:r>
+        <w:rPr>
+          <w:rFonts w:ascii="Times New Roman" w:hAnsi="Times New Roman" w:cs="Times New Roman"/>
+          <w:sz w:val="28"/>
+          <w:szCs w:val="28"/>
+        </w:rPr>
+        <w:lastRenderedPageBreak/>
+        <w:t>Method: GET</w:t>
+      </w:r>
+    </w:p>
+    <w:p>
+      <w:pPr>
+        <w:pStyle w:val="Listaszerbekezds"/>
+        <w:numPr>
+          <w:ilvl w:val="1"/>
+          <w:numId w:val="5"/>
+        </w:numPr>
+        <w:rPr>
+          <w:rFonts w:ascii="Times New Roman" w:hAnsi="Times New Roman" w:cs="Times New Roman"/>
+          <w:color w:val="000000" w:themeColor="text1"/>
+          <w:sz w:val="24"/>
+          <w:szCs w:val="24"/>
+        </w:rPr>
+      </w:pPr>
+      <w:r>
+        <w:rPr>
+          <w:rFonts w:ascii="Times New Roman" w:hAnsi="Times New Roman" w:cs="Times New Roman"/>
+          <w:color w:val="000000" w:themeColor="text1"/>
+          <w:sz w:val="28"/>
+          <w:szCs w:val="28"/>
+        </w:rPr>
+        <w:t xml:space="preserve">Response: </w:t>
+      </w:r>
+      <w:proofErr w:type="gramStart"/>
+      <w:r>
+        <w:rPr>
+          <w:rFonts w:ascii="Times New Roman" w:hAnsi="Times New Roman" w:cs="Times New Roman"/>
+          <w:color w:val="000000" w:themeColor="text1"/>
+          <w:sz w:val="28"/>
+          <w:szCs w:val="28"/>
+        </w:rPr>
+        <w:t>Status(</w:t>
+      </w:r>
+      <w:proofErr w:type="gramEnd"/>
+      <w:r>
+        <w:rPr>
+          <w:rFonts w:ascii="Times New Roman" w:hAnsi="Times New Roman" w:cs="Times New Roman"/>
+          <w:color w:val="000000" w:themeColor="text1"/>
+          <w:sz w:val="28"/>
+          <w:szCs w:val="28"/>
+        </w:rPr>
+        <w:t>200)</w:t>
+      </w:r>
+    </w:p>
+    <w:p>
+      <w:pPr>
+        <w:pStyle w:val="Listaszerbekezds"/>
+        <w:numPr>
+          <w:ilvl w:val="0"/>
+          <w:numId w:val="5"/>
+        </w:numPr>
+        <w:rPr>
+          <w:rFonts w:ascii="Times New Roman" w:hAnsi="Times New Roman" w:cs="Times New Roman"/>
+          <w:color w:val="FF0000"/>
+          <w:sz w:val="28"/>
+          <w:szCs w:val="28"/>
+        </w:rPr>
+      </w:pPr>
+      <w:r>
+        <w:rPr>
+          <w:rFonts w:ascii="Times New Roman" w:hAnsi="Times New Roman" w:cs="Times New Roman"/>
+          <w:sz w:val="28"/>
+          <w:szCs w:val="28"/>
+        </w:rPr>
+        <w:t>Log out:</w:t>
+      </w:r>
+    </w:p>
+    <w:p>
+      <w:pPr>
+        <w:pStyle w:val="Listaszerbekezds"/>
+        <w:numPr>
+          <w:ilvl w:val="1"/>
+          <w:numId w:val="5"/>
+        </w:numPr>
+        <w:rPr>
+          <w:rFonts w:ascii="Times New Roman" w:hAnsi="Times New Roman" w:cs="Times New Roman"/>
+          <w:color w:val="FF0000"/>
+          <w:sz w:val="28"/>
+          <w:szCs w:val="28"/>
+        </w:rPr>
+      </w:pPr>
+      <w:r>
+        <w:rPr>
+          <w:rFonts w:ascii="Times New Roman" w:hAnsi="Times New Roman" w:cs="Times New Roman"/>
+          <w:sz w:val="28"/>
+          <w:szCs w:val="28"/>
+        </w:rPr>
+        <w:t>End</w:t>
+      </w:r>
+      <w:r>
+        <w:rPr>
+          <w:rFonts w:ascii="Times New Roman" w:hAnsi="Times New Roman" w:cs="Times New Roman"/>
+          <w:sz w:val="28"/>
+          <w:szCs w:val="28"/>
+        </w:rPr>
+        <w:t>point: /logout</w:t>
+      </w:r>
+    </w:p>
+    <w:p>
+      <w:pPr>
+        <w:pStyle w:val="Listaszerbekezds"/>
+        <w:numPr>
+          <w:ilvl w:val="1"/>
+          <w:numId w:val="5"/>
+        </w:numPr>
+        <w:rPr>
+          <w:rFonts w:ascii="Times New Roman" w:hAnsi="Times New Roman" w:cs="Times New Roman"/>
+          <w:color w:val="FF0000"/>
+          <w:sz w:val="28"/>
+          <w:szCs w:val="28"/>
+        </w:rPr>
+      </w:pPr>
+      <w:r>
+        <w:rPr>
+          <w:rFonts w:ascii="Times New Roman" w:hAnsi="Times New Roman" w:cs="Times New Roman"/>
+          <w:sz w:val="28"/>
+          <w:szCs w:val="28"/>
+        </w:rPr>
+        <w:t>Method: GET</w:t>
+      </w:r>
+    </w:p>
+    <w:p>
+      <w:pPr>
+        <w:pStyle w:val="Listaszerbekezds"/>
+        <w:numPr>
+          <w:ilvl w:val="1"/>
+          <w:numId w:val="5"/>
+        </w:numPr>
+        <w:rPr>
+          <w:rFonts w:ascii="Times New Roman" w:hAnsi="Times New Roman" w:cs="Times New Roman"/>
+          <w:color w:val="000000" w:themeColor="text1"/>
+          <w:sz w:val="24"/>
+          <w:szCs w:val="24"/>
+        </w:rPr>
+      </w:pPr>
+      <w:r>
+        <w:rPr>
+          <w:rFonts w:ascii="Times New Roman" w:hAnsi="Times New Roman" w:cs="Times New Roman"/>
+          <w:color w:val="000000" w:themeColor="text1"/>
+          <w:sz w:val="28"/>
+          <w:szCs w:val="28"/>
+        </w:rPr>
+        <w:t xml:space="preserve">Response: </w:t>
+      </w:r>
+      <w:proofErr w:type="gramStart"/>
+      <w:r>
+        <w:rPr>
+          <w:rFonts w:ascii="Times New Roman" w:hAnsi="Times New Roman" w:cs="Times New Roman"/>
+          <w:color w:val="000000" w:themeColor="text1"/>
+          <w:sz w:val="28"/>
+          <w:szCs w:val="28"/>
+        </w:rPr>
+        <w:t>Status(</w:t>
+      </w:r>
+      <w:proofErr w:type="gramEnd"/>
+      <w:r>
+        <w:rPr>
+          <w:rFonts w:ascii="Times New Roman" w:hAnsi="Times New Roman" w:cs="Times New Roman"/>
+          <w:color w:val="000000" w:themeColor="text1"/>
+          <w:sz w:val="28"/>
+          <w:szCs w:val="28"/>
+        </w:rPr>
+        <w:t>200)</w:t>
+      </w:r>
+    </w:p>
+    <w:p>
+      <w:pPr>
+        <w:rPr>
+          <w:rFonts w:ascii="Times New Roman" w:hAnsi="Times New Roman" w:cs="Times New Roman"/>
+          <w:color w:val="000000" w:themeColor="text1"/>
+          <w:sz w:val="28"/>
+          <w:szCs w:val="28"/>
+        </w:rPr>
+      </w:pPr>
+      <w:r>
+        <w:rPr>
+          <w:rFonts w:ascii="Times New Roman" w:hAnsi="Times New Roman" w:cs="Times New Roman"/>
+          <w:color w:val="000000" w:themeColor="text1"/>
+          <w:sz w:val="32"/>
+          <w:szCs w:val="32"/>
+        </w:rPr>
+        <w:t xml:space="preserve">Cities Endpoint: </w:t>
+      </w:r>
+      <w:r>
+        <w:rPr>
+          <w:rFonts w:ascii="Times New Roman" w:hAnsi="Times New Roman" w:cs="Times New Roman"/>
+          <w:color w:val="000000" w:themeColor="text1"/>
+          <w:sz w:val="28"/>
+          <w:szCs w:val="28"/>
+        </w:rPr>
+        <w:t>/cities</w:t>
+      </w:r>
+    </w:p>
+    <w:p>
+      <w:pPr>
+        <w:rPr>
+          <w:rFonts w:ascii="Times New Roman" w:hAnsi="Times New Roman" w:cs="Times New Roman"/>
+          <w:color w:val="000000" w:themeColor="text1"/>
+          <w:sz w:val="28"/>
+          <w:szCs w:val="28"/>
+        </w:rPr>
+      </w:pPr>
+      <w:r>
+        <w:rPr>
+          <w:rFonts w:ascii="Times New Roman" w:hAnsi="Times New Roman" w:cs="Times New Roman"/>
+          <w:color w:val="000000" w:themeColor="text1"/>
+          <w:sz w:val="28"/>
+          <w:szCs w:val="28"/>
+        </w:rPr>
+        <w:t>Requirements: Run script: Filling_cities.py</w:t>
+      </w:r>
+    </w:p>
+    <w:p>
+      <w:pPr>
+        <w:pStyle w:val="Listaszerbekezds"/>
+        <w:numPr>
+          <w:ilvl w:val="0"/>
+          <w:numId w:val="6"/>
+        </w:numPr>
+        <w:rPr>
+          <w:rFonts w:ascii="Times New Roman" w:hAnsi="Times New Roman" w:cs="Times New Roman"/>
+          <w:color w:val="000000" w:themeColor="text1"/>
+          <w:sz w:val="28"/>
+          <w:szCs w:val="28"/>
+        </w:rPr>
+      </w:pPr>
+      <w:r>
+        <w:rPr>
+          <w:rFonts w:ascii="Times New Roman" w:hAnsi="Times New Roman" w:cs="Times New Roman"/>
+          <w:color w:val="000000" w:themeColor="text1"/>
+          <w:sz w:val="28"/>
+          <w:szCs w:val="28"/>
+        </w:rPr>
+        <w:t>All:</w:t>
+      </w:r>
+    </w:p>
+    <w:p>
+      <w:pPr>
+        <w:pStyle w:val="Listaszerbekezds"/>
+        <w:numPr>
+          <w:ilvl w:val="1"/>
+          <w:numId w:val="6"/>
+        </w:numPr>
+        <w:rPr>
+          <w:rFonts w:ascii="Times New Roman" w:hAnsi="Times New Roman" w:cs="Times New Roman"/>
+          <w:color w:val="000000" w:themeColor="text1"/>
+          <w:sz w:val="28"/>
+          <w:szCs w:val="28"/>
+        </w:rPr>
+      </w:pPr>
+      <w:r>
+        <w:rPr>
+          <w:rFonts w:ascii="Times New Roman" w:hAnsi="Times New Roman" w:cs="Times New Roman"/>
+          <w:color w:val="000000" w:themeColor="text1"/>
+          <w:sz w:val="28"/>
+          <w:szCs w:val="28"/>
+        </w:rPr>
+        <w:t>Endpoint: /all</w:t>
+      </w:r>
+    </w:p>
+    <w:p>
+      <w:pPr>
+        <w:pStyle w:val="Listaszerbekezds"/>
+        <w:numPr>
+          <w:ilvl w:val="1"/>
+          <w:numId w:val="6"/>
+        </w:numPr>
+        <w:rPr>
+          <w:rFonts w:ascii="Times New Roman" w:hAnsi="Times New Roman" w:cs="Times New Roman"/>
+          <w:color w:val="000000" w:themeColor="text1"/>
+          <w:sz w:val="28"/>
+          <w:szCs w:val="28"/>
+        </w:rPr>
+      </w:pPr>
+      <w:r>
+        <w:rPr>
+          <w:rFonts w:ascii="Times New Roman" w:hAnsi="Times New Roman" w:cs="Times New Roman"/>
+          <w:color w:val="000000" w:themeColor="text1"/>
+          <w:sz w:val="28"/>
+          <w:szCs w:val="28"/>
+        </w:rPr>
+        <w:t>Method: GET</w:t>
+      </w:r>
+    </w:p>
+    <w:p>
+      <w:pPr>
+        <w:pStyle w:val="Listaszerbekezds"/>
+        <w:numPr>
+          <w:ilvl w:val="1"/>
+          <w:numId w:val="6"/>
+        </w:numPr>
+        <w:rPr>
+          <w:rFonts w:ascii="Times New Roman" w:hAnsi="Times New Roman" w:cs="Times New Roman"/>
+          <w:color w:val="000000" w:themeColor="text1"/>
+          <w:sz w:val="28"/>
+          <w:szCs w:val="28"/>
+        </w:rPr>
+      </w:pPr>
+      <w:r>
+        <w:rPr>
+          <w:rFonts w:ascii="Times New Roman" w:hAnsi="Times New Roman" w:cs="Times New Roman"/>
+          <w:color w:val="000000" w:themeColor="text1"/>
+          <w:sz w:val="28"/>
+          <w:szCs w:val="28"/>
+        </w:rPr>
+        <w:t xml:space="preserve">Response: </w:t>
+      </w:r>
+      <w:proofErr w:type="gramStart"/>
+      <w:r>
+        <w:rPr>
+          <w:rFonts w:ascii="Times New Roman" w:hAnsi="Times New Roman" w:cs="Times New Roman"/>
+          <w:color w:val="000000" w:themeColor="text1"/>
+          <w:sz w:val="28"/>
+          <w:szCs w:val="28"/>
+        </w:rPr>
+        <w:t>Status(</w:t>
+      </w:r>
+      <w:proofErr w:type="gramEnd"/>
+      <w:r>
+        <w:rPr>
+          <w:rFonts w:ascii="Times New Roman" w:hAnsi="Times New Roman" w:cs="Times New Roman"/>
+          <w:color w:val="000000" w:themeColor="text1"/>
+          <w:sz w:val="28"/>
+          <w:szCs w:val="28"/>
+        </w:rPr>
+        <w:t>200)</w:t>
+      </w:r>
+    </w:p>
+    <w:p>
+      <w:pPr>
+        <w:pStyle w:val="Listaszerbekezds"/>
+        <w:numPr>
+          <w:ilvl w:val="2"/>
+          <w:numId w:val="6"/>
+        </w:numPr>
+        <w:rPr>
+          <w:rFonts w:ascii="Times New Roman" w:hAnsi="Times New Roman" w:cs="Times New Roman"/>
+          <w:color w:val="000000" w:themeColor="text1"/>
+          <w:sz w:val="28"/>
+          <w:szCs w:val="28"/>
+        </w:rPr>
+      </w:pPr>
+      <w:r>
+        <w:rPr>
+          <w:rFonts w:ascii="Times New Roman" w:hAnsi="Times New Roman" w:cs="Times New Roman"/>
+          <w:color w:val="000000" w:themeColor="text1"/>
+          <w:sz w:val="28"/>
+          <w:szCs w:val="28"/>
+        </w:rPr>
+        <w:t>Body: [“város1”, “város2”]</w:t>
+      </w:r>
+    </w:p>
+    <w:p>
+      <w:pPr>
+        <w:pStyle w:val="Listaszerbekezds"/>
+        <w:numPr>
+          <w:ilvl w:val="0"/>
+          <w:numId w:val="6"/>
+        </w:numPr>
+        <w:rPr>
+          <w:rFonts w:ascii="Times New Roman" w:hAnsi="Times New Roman" w:cs="Times New Roman"/>
+          <w:color w:val="000000" w:themeColor="text1"/>
+          <w:sz w:val="28"/>
+          <w:szCs w:val="28"/>
+        </w:rPr>
+      </w:pPr>
+      <w:r>
+        <w:rPr>
+          <w:rFonts w:ascii="Times New Roman" w:hAnsi="Times New Roman" w:cs="Times New Roman"/>
+          <w:color w:val="000000" w:themeColor="text1"/>
+          <w:sz w:val="28"/>
+          <w:szCs w:val="28"/>
+        </w:rPr>
+        <w:t xml:space="preserve">Search </w:t>
+      </w:r>
+      <w:proofErr w:type="gramStart"/>
+      <w:r>
+        <w:rPr>
+          <w:rFonts w:ascii="Times New Roman" w:hAnsi="Times New Roman" w:cs="Times New Roman"/>
+          <w:color w:val="000000" w:themeColor="text1"/>
+          <w:sz w:val="28"/>
+          <w:szCs w:val="28"/>
+        </w:rPr>
+        <w:t>For</w:t>
+      </w:r>
+      <w:proofErr w:type="gramEnd"/>
+      <w:r>
+        <w:rPr>
+          <w:rFonts w:ascii="Times New Roman" w:hAnsi="Times New Roman" w:cs="Times New Roman"/>
+          <w:color w:val="000000" w:themeColor="text1"/>
+          <w:sz w:val="28"/>
+          <w:szCs w:val="28"/>
+        </w:rPr>
+        <w:t xml:space="preserve"> city:</w:t>
+      </w:r>
+    </w:p>
+    <w:p>
+      <w:pPr>
+        <w:pStyle w:val="Listaszerbekezds"/>
+        <w:numPr>
+          <w:ilvl w:val="1"/>
+          <w:numId w:val="6"/>
+        </w:numPr>
+        <w:rPr>
+          <w:rFonts w:ascii="Times New Roman" w:hAnsi="Times New Roman" w:cs="Times New Roman"/>
+          <w:color w:val="000000" w:themeColor="text1"/>
+          <w:sz w:val="28"/>
+          <w:szCs w:val="28"/>
+        </w:rPr>
+      </w:pPr>
+      <w:r>
+        <w:rPr>
+          <w:rFonts w:ascii="Times New Roman" w:hAnsi="Times New Roman" w:cs="Times New Roman"/>
+          <w:color w:val="000000" w:themeColor="text1"/>
+          <w:sz w:val="28"/>
+          <w:szCs w:val="28"/>
+        </w:rPr>
+        <w:t>Endpoint: /</w:t>
+      </w:r>
+      <w:proofErr w:type="spellStart"/>
+      <w:proofErr w:type="gramStart"/>
+      <w:r>
+        <w:rPr>
+          <w:rFonts w:ascii="Times New Roman" w:hAnsi="Times New Roman" w:cs="Times New Roman"/>
+          <w:color w:val="000000" w:themeColor="text1"/>
+          <w:sz w:val="28"/>
+          <w:szCs w:val="28"/>
+        </w:rPr>
+        <w:t>search?city</w:t>
+      </w:r>
+      <w:proofErr w:type="spellEnd"/>
+      <w:proofErr w:type="gramEnd"/>
+      <w:r>
+        <w:rPr>
+          <w:rFonts w:ascii="Times New Roman" w:hAnsi="Times New Roman" w:cs="Times New Roman"/>
+          <w:color w:val="000000" w:themeColor="text1"/>
+          <w:sz w:val="28"/>
+          <w:szCs w:val="28"/>
+        </w:rPr>
+        <w:t>=</w:t>
+      </w:r>
+    </w:p>
+    <w:p>
+      <w:pPr>
+        <w:pStyle w:val="Listaszerbekezds"/>
+        <w:numPr>
+          <w:ilvl w:val="1"/>
+          <w:numId w:val="6"/>
+        </w:numPr>
+        <w:rPr>
+          <w:rFonts w:ascii="Times New Roman" w:hAnsi="Times New Roman" w:cs="Times New Roman"/>
+          <w:color w:val="000000" w:themeColor="text1"/>
+          <w:sz w:val="28"/>
+          <w:szCs w:val="28"/>
+        </w:rPr>
+      </w:pPr>
+      <w:r>
+        <w:rPr>
+          <w:rFonts w:ascii="Times New Roman" w:hAnsi="Times New Roman" w:cs="Times New Roman"/>
+          <w:color w:val="000000" w:themeColor="text1"/>
+          <w:sz w:val="28"/>
+          <w:szCs w:val="28"/>
+        </w:rPr>
+        <w:t>Method: GET</w:t>
+      </w:r>
+    </w:p>
+    <w:p>
+      <w:pPr>
+        <w:pStyle w:val="Listaszerbekezds"/>
+        <w:numPr>
+          <w:ilvl w:val="1"/>
+          <w:numId w:val="6"/>
+        </w:numPr>
+        <w:rPr>
+          <w:rFonts w:ascii="Times New Roman" w:hAnsi="Times New Roman" w:cs="Times New Roman"/>
+          <w:color w:val="000000" w:themeColor="text1"/>
+          <w:sz w:val="28"/>
+          <w:szCs w:val="28"/>
+        </w:rPr>
+      </w:pPr>
+      <w:r>
+        <w:rPr>
+          <w:rFonts w:ascii="Times New Roman" w:hAnsi="Times New Roman" w:cs="Times New Roman"/>
+          <w:color w:val="000000" w:themeColor="text1"/>
+          <w:sz w:val="28"/>
+          <w:szCs w:val="28"/>
+        </w:rPr>
+        <w:t xml:space="preserve">Response: </w:t>
+      </w:r>
+      <w:proofErr w:type="gramStart"/>
+      <w:r>
+        <w:rPr>
+          <w:rFonts w:ascii="Times New Roman" w:hAnsi="Times New Roman" w:cs="Times New Roman"/>
+          <w:color w:val="000000" w:themeColor="text1"/>
+          <w:sz w:val="28"/>
+          <w:szCs w:val="28"/>
+        </w:rPr>
+        <w:t>Status(</w:t>
+      </w:r>
+      <w:proofErr w:type="gramEnd"/>
+      <w:r>
+        <w:rPr>
+          <w:rFonts w:ascii="Times New Roman" w:hAnsi="Times New Roman" w:cs="Times New Roman"/>
+          <w:color w:val="000000" w:themeColor="text1"/>
+          <w:sz w:val="28"/>
+          <w:szCs w:val="28"/>
+        </w:rPr>
+        <w:t>200)</w:t>
+      </w:r>
+    </w:p>
+    <w:p>
+      <w:pPr>
+        <w:pStyle w:val="Listaszerbekezds"/>
+        <w:numPr>
+          <w:ilvl w:val="2"/>
+          <w:numId w:val="6"/>
+        </w:numPr>
+        <w:rPr>
+          <w:rFonts w:ascii="Times New Roman" w:hAnsi="Times New Roman" w:cs="Times New Roman"/>
+          <w:color w:val="000000" w:themeColor="text1"/>
+          <w:sz w:val="28"/>
+          <w:szCs w:val="28"/>
+        </w:rPr>
+      </w:pPr>
+      <w:r>
+        <w:rPr>
+          <w:rFonts w:ascii="Times New Roman" w:hAnsi="Times New Roman" w:cs="Times New Roman"/>
+          <w:color w:val="000000" w:themeColor="text1"/>
+          <w:sz w:val="28"/>
+          <w:szCs w:val="28"/>
+        </w:rPr>
+        <w:t>Body: [“város1”, “város2”]</w:t>
+      </w:r>
+    </w:p>
+    <w:p>
+      <w:pPr>
+        <w:pStyle w:val="Listaszerbekezds"/>
+        <w:numPr>
+          <w:ilvl w:val="0"/>
+          <w:numId w:val="6"/>
+        </w:numPr>
+        <w:rPr>
+          <w:rFonts w:ascii="Times New Roman" w:hAnsi="Times New Roman" w:cs="Times New Roman"/>
+          <w:color w:val="000000" w:themeColor="text1"/>
+          <w:sz w:val="28"/>
+          <w:szCs w:val="28"/>
+        </w:rPr>
+      </w:pPr>
+      <w:r>
+        <w:rPr>
+          <w:rFonts w:ascii="Times New Roman" w:hAnsi="Times New Roman" w:cs="Times New Roman"/>
+          <w:color w:val="000000" w:themeColor="text1"/>
+          <w:sz w:val="28"/>
+          <w:szCs w:val="28"/>
+        </w:rPr>
+        <w:t>Search city by postal code:</w:t>
+      </w:r>
+    </w:p>
+    <w:p>
+      <w:pPr>
+        <w:pStyle w:val="Listaszerbekezds"/>
+        <w:numPr>
+          <w:ilvl w:val="1"/>
+          <w:numId w:val="6"/>
+        </w:numPr>
+        <w:rPr>
+          <w:rFonts w:ascii="Times New Roman" w:hAnsi="Times New Roman" w:cs="Times New Roman"/>
+          <w:color w:val="000000" w:themeColor="text1"/>
+          <w:sz w:val="28"/>
+          <w:szCs w:val="28"/>
+        </w:rPr>
+      </w:pPr>
+      <w:r>
+        <w:rPr>
+          <w:rFonts w:ascii="Times New Roman" w:hAnsi="Times New Roman" w:cs="Times New Roman"/>
+          <w:color w:val="000000" w:themeColor="text1"/>
+          <w:sz w:val="28"/>
+          <w:szCs w:val="28"/>
+        </w:rPr>
+        <w:t>Endpoint: /postal/</w:t>
+      </w:r>
+      <w:proofErr w:type="spellStart"/>
+      <w:proofErr w:type="gramStart"/>
+      <w:r>
+        <w:rPr>
+          <w:rFonts w:ascii="Times New Roman" w:hAnsi="Times New Roman" w:cs="Times New Roman"/>
+          <w:color w:val="000000" w:themeColor="text1"/>
+          <w:sz w:val="28"/>
+          <w:szCs w:val="28"/>
+        </w:rPr>
+        <w:t>search?postal</w:t>
+      </w:r>
+      <w:proofErr w:type="spellEnd"/>
+      <w:proofErr w:type="gramEnd"/>
+      <w:r>
+        <w:rPr>
+          <w:rFonts w:ascii="Times New Roman" w:hAnsi="Times New Roman" w:cs="Times New Roman"/>
+          <w:color w:val="000000" w:themeColor="text1"/>
+          <w:sz w:val="28"/>
+          <w:szCs w:val="28"/>
+        </w:rPr>
+        <w:t>=</w:t>
+      </w:r>
+    </w:p>
+    <w:p>
+      <w:pPr>
+        <w:pStyle w:val="Listaszerbekezds"/>
+        <w:numPr>
+          <w:ilvl w:val="1"/>
+          <w:numId w:val="6"/>
+        </w:numPr>
+        <w:rPr>
+          <w:rFonts w:ascii="Times New Roman" w:hAnsi="Times New Roman" w:cs="Times New Roman"/>
+          <w:color w:val="000000" w:themeColor="text1"/>
+          <w:sz w:val="28"/>
+          <w:szCs w:val="28"/>
+        </w:rPr>
+      </w:pPr>
+      <w:r>
+        <w:rPr>
+          <w:rFonts w:ascii="Times New Roman" w:hAnsi="Times New Roman" w:cs="Times New Roman"/>
+          <w:color w:val="000000" w:themeColor="text1"/>
+          <w:sz w:val="28"/>
+          <w:szCs w:val="28"/>
+        </w:rPr>
+        <w:t>Method: GET</w:t>
+      </w:r>
+    </w:p>
+    <w:p>
+      <w:pPr>
+        <w:pStyle w:val="Listaszerbekezds"/>
+        <w:numPr>
+          <w:ilvl w:val="1"/>
+          <w:numId w:val="6"/>
+        </w:numPr>
+        <w:rPr>
+          <w:rFonts w:ascii="Times New Roman" w:hAnsi="Times New Roman" w:cs="Times New Roman"/>
+          <w:color w:val="000000" w:themeColor="text1"/>
+          <w:sz w:val="28"/>
+          <w:szCs w:val="28"/>
+        </w:rPr>
+      </w:pPr>
+      <w:r>
+        <w:rPr>
+          <w:rFonts w:ascii="Times New Roman" w:hAnsi="Times New Roman" w:cs="Times New Roman"/>
+          <w:color w:val="000000" w:themeColor="text1"/>
+          <w:sz w:val="28"/>
+          <w:szCs w:val="28"/>
+        </w:rPr>
+        <w:t xml:space="preserve">Response: </w:t>
+      </w:r>
+      <w:proofErr w:type="gramStart"/>
+      <w:r>
+        <w:rPr>
+          <w:rFonts w:ascii="Times New Roman" w:hAnsi="Times New Roman" w:cs="Times New Roman"/>
+          <w:color w:val="000000" w:themeColor="text1"/>
+          <w:sz w:val="28"/>
+          <w:szCs w:val="28"/>
+        </w:rPr>
+        <w:t>Status(</w:t>
+      </w:r>
+      <w:proofErr w:type="gramEnd"/>
+      <w:r>
+        <w:rPr>
+          <w:rFonts w:ascii="Times New Roman" w:hAnsi="Times New Roman" w:cs="Times New Roman"/>
+          <w:color w:val="000000" w:themeColor="text1"/>
+          <w:sz w:val="28"/>
+          <w:szCs w:val="28"/>
+        </w:rPr>
+        <w:t>200)</w:t>
+      </w:r>
+    </w:p>
+    <w:p>
+      <w:pPr>
+        <w:pStyle w:val="Listaszerbekezds"/>
+        <w:numPr>
+          <w:ilvl w:val="2"/>
+          <w:numId w:val="6"/>
+        </w:numPr>
+        <w:rPr>
+          <w:rFonts w:ascii="Times New Roman" w:hAnsi="Times New Roman" w:cs="Times New Roman"/>
+          <w:color w:val="000000" w:themeColor="text1"/>
+          <w:sz w:val="28"/>
+          <w:szCs w:val="28"/>
+        </w:rPr>
+      </w:pPr>
+      <w:r>
+        <w:rPr>
+          <w:rFonts w:ascii="Times New Roman" w:hAnsi="Times New Roman" w:cs="Times New Roman"/>
+          <w:color w:val="000000" w:themeColor="text1"/>
+          <w:sz w:val="28"/>
+          <w:szCs w:val="28"/>
+        </w:rPr>
+        <w:t>Body: [“város1”, “város2”]</w:t>
+      </w:r>
+    </w:p>
+    <w:p>
+      <w:pPr>
+        <w:pStyle w:val="Listaszerbekezds"/>
+        <w:numPr>
+          <w:ilvl w:val="0"/>
+          <w:numId w:val="6"/>
+        </w:numPr>
+        <w:rPr>
+          <w:rFonts w:ascii="Times New Roman" w:hAnsi="Times New Roman" w:cs="Times New Roman"/>
+          <w:color w:val="000000" w:themeColor="text1"/>
+          <w:sz w:val="28"/>
+          <w:szCs w:val="28"/>
+        </w:rPr>
+      </w:pPr>
+      <w:r>
+        <w:rPr>
+          <w:rFonts w:ascii="Times New Roman" w:hAnsi="Times New Roman" w:cs="Times New Roman"/>
+          <w:color w:val="000000" w:themeColor="text1"/>
+          <w:sz w:val="28"/>
+          <w:szCs w:val="28"/>
+        </w:rPr>
+        <w:t>Search postal by city:</w:t>
+      </w:r>
+    </w:p>
+    <w:p>
+      <w:pPr>
+        <w:pStyle w:val="Listaszerbekezds"/>
+        <w:numPr>
+          <w:ilvl w:val="1"/>
+          <w:numId w:val="6"/>
+        </w:numPr>
+        <w:rPr>
+          <w:rFonts w:ascii="Times New Roman" w:hAnsi="Times New Roman" w:cs="Times New Roman"/>
+          <w:color w:val="000000" w:themeColor="text1"/>
+          <w:sz w:val="28"/>
+          <w:szCs w:val="28"/>
+        </w:rPr>
+      </w:pPr>
+      <w:r>
+        <w:rPr>
+          <w:rFonts w:ascii="Times New Roman" w:hAnsi="Times New Roman" w:cs="Times New Roman"/>
+          <w:color w:val="000000" w:themeColor="text1"/>
+          <w:sz w:val="28"/>
+          <w:szCs w:val="28"/>
+        </w:rPr>
+        <w:t>Endpoint: /search/city/</w:t>
+      </w:r>
+      <w:proofErr w:type="spellStart"/>
+      <w:proofErr w:type="gramStart"/>
+      <w:r>
+        <w:rPr>
+          <w:rFonts w:ascii="Times New Roman" w:hAnsi="Times New Roman" w:cs="Times New Roman"/>
+          <w:color w:val="000000" w:themeColor="text1"/>
+          <w:sz w:val="28"/>
+          <w:szCs w:val="28"/>
+        </w:rPr>
+        <w:t>postal?city</w:t>
+      </w:r>
+      <w:proofErr w:type="spellEnd"/>
+      <w:proofErr w:type="gramEnd"/>
+      <w:r>
+        <w:rPr>
+          <w:rFonts w:ascii="Times New Roman" w:hAnsi="Times New Roman" w:cs="Times New Roman"/>
+          <w:color w:val="000000" w:themeColor="text1"/>
+          <w:sz w:val="28"/>
+          <w:szCs w:val="28"/>
+        </w:rPr>
+        <w:t>=</w:t>
+      </w:r>
+    </w:p>
+    <w:p>
+      <w:pPr>
+        <w:pStyle w:val="Listaszerbekezds"/>
+        <w:numPr>
+          <w:ilvl w:val="1"/>
+          <w:numId w:val="6"/>
+        </w:numPr>
+        <w:rPr>
+          <w:rFonts w:ascii="Times New Roman" w:hAnsi="Times New Roman" w:cs="Times New Roman"/>
+          <w:color w:val="000000" w:themeColor="text1"/>
+          <w:sz w:val="28"/>
+          <w:szCs w:val="28"/>
+        </w:rPr>
+      </w:pPr>
+      <w:r>
+        <w:rPr>
+          <w:rFonts w:ascii="Times New Roman" w:hAnsi="Times New Roman" w:cs="Times New Roman"/>
+          <w:color w:val="000000" w:themeColor="text1"/>
+          <w:sz w:val="28"/>
+          <w:szCs w:val="28"/>
+        </w:rPr>
+        <w:t>Method: GET</w:t>
+      </w:r>
+    </w:p>
+    <w:p>
+      <w:pPr>
+        <w:pStyle w:val="Listaszerbekezds"/>
+        <w:numPr>
+          <w:ilvl w:val="1"/>
+          <w:numId w:val="6"/>
+        </w:numPr>
+        <w:rPr>
+          <w:rFonts w:ascii="Times New Roman" w:hAnsi="Times New Roman" w:cs="Times New Roman"/>
+          <w:color w:val="000000" w:themeColor="text1"/>
+          <w:sz w:val="28"/>
+          <w:szCs w:val="28"/>
+        </w:rPr>
+      </w:pPr>
+      <w:r>
+        <w:rPr>
+          <w:rFonts w:ascii="Times New Roman" w:hAnsi="Times New Roman" w:cs="Times New Roman"/>
+          <w:color w:val="000000" w:themeColor="text1"/>
+          <w:sz w:val="28"/>
+          <w:szCs w:val="28"/>
+        </w:rPr>
+        <w:t xml:space="preserve">Response: </w:t>
+      </w:r>
+      <w:proofErr w:type="gramStart"/>
+      <w:r>
+        <w:rPr>
+          <w:rFonts w:ascii="Times New Roman" w:hAnsi="Times New Roman" w:cs="Times New Roman"/>
+          <w:color w:val="000000" w:themeColor="text1"/>
+          <w:sz w:val="28"/>
+          <w:szCs w:val="28"/>
+        </w:rPr>
+        <w:t>Status(</w:t>
+      </w:r>
+      <w:proofErr w:type="gramEnd"/>
+      <w:r>
+        <w:rPr>
+          <w:rFonts w:ascii="Times New Roman" w:hAnsi="Times New Roman" w:cs="Times New Roman"/>
+          <w:color w:val="000000" w:themeColor="text1"/>
+          <w:sz w:val="28"/>
+          <w:szCs w:val="28"/>
+        </w:rPr>
+        <w:t>200)</w:t>
+      </w:r>
+    </w:p>
+    <w:p>
+      <w:pPr>
+        <w:pStyle w:val="Listaszerbekezds"/>
+        <w:numPr>
+          <w:ilvl w:val="2"/>
+          <w:numId w:val="6"/>
+        </w:numPr>
+        <w:rPr>
+          <w:rFonts w:ascii="Times New Roman" w:hAnsi="Times New Roman" w:cs="Times New Roman"/>
+          <w:color w:val="000000" w:themeColor="text1"/>
+          <w:sz w:val="28"/>
+          <w:szCs w:val="28"/>
+        </w:rPr>
+      </w:pPr>
+      <w:r>
+        <w:rPr>
+          <w:rFonts w:ascii="Times New Roman" w:hAnsi="Times New Roman" w:cs="Times New Roman"/>
+          <w:color w:val="000000" w:themeColor="text1"/>
+          <w:sz w:val="28"/>
+          <w:szCs w:val="28"/>
+        </w:rPr>
+        <w:t>Body: [“0001”, “0002</w:t>
+      </w:r>
       <w:bookmarkStart w:id="0" w:name="_GoBack"/>
       <w:bookmarkEnd w:id="0"/>
-    </w:p>
-    <w:p>
-      <w:pPr>
-        <w:shd w:val="clear" w:color="auto" w:fill="212121"/>
-        <w:spacing w:line="270" w:lineRule="atLeast"/>
-        <w:rPr>
-          <w:rFonts w:ascii="Courier New" w:eastAsia="Times New Roman" w:hAnsi="Courier New" w:cs="Courier New"/>
-          <w:color w:val="F8F8F2"/>
-          <w:sz w:val="18"/>
-          <w:szCs w:val="18"/>
-        </w:rPr>
-      </w:pPr>
-      <w:r>
-        <w:rPr>
-          <w:rFonts w:ascii="Times New Roman" w:hAnsi="Times New Roman" w:cs="Times New Roman"/>
-          <w:sz w:val="28"/>
-          <w:szCs w:val="28"/>
-        </w:rPr>
-        <w:t>Body:</w:t>
-      </w:r>
-      <w:r>
-        <w:rPr>
-          <w:rFonts w:ascii="Courier New" w:hAnsi="Courier New" w:cs="Courier New"/>
-          <w:color w:val="DCDCDC"/>
-          <w:sz w:val="18"/>
-          <w:szCs w:val="18"/>
-        </w:rPr>
-        <w:t xml:space="preserve"> </w:t>
-      </w:r>
-      <w:r>
-        <w:rPr>
-          <w:rFonts w:ascii="Courier New" w:eastAsia="Times New Roman" w:hAnsi="Courier New" w:cs="Courier New"/>
-          <w:color w:val="DCDCDC"/>
-          <w:sz w:val="18"/>
-          <w:szCs w:val="18"/>
-        </w:rPr>
-        <w:t>{</w:t>
-      </w:r>
-    </w:p>
-    <w:p>
-      <w:pPr>
-        <w:shd w:val="clear" w:color="auto" w:fill="212121"/>
-        <w:spacing w:after="0" w:line="270" w:lineRule="atLeast"/>
-        <w:rPr>
-          <w:rFonts w:ascii="Courier New" w:eastAsia="Times New Roman" w:hAnsi="Courier New" w:cs="Courier New"/>
-          <w:color w:val="F8F8F2"/>
-          <w:sz w:val="18"/>
-          <w:szCs w:val="18"/>
-        </w:rPr>
-      </w:pPr>
-      <w:r>
-        <w:rPr>
-          <w:rFonts w:ascii="Courier New" w:eastAsia="Times New Roman" w:hAnsi="Courier New" w:cs="Courier New"/>
-          <w:color w:val="F8F8F2"/>
-          <w:sz w:val="18"/>
-          <w:szCs w:val="18"/>
-        </w:rPr>
-        <w:t xml:space="preserve">    </w:t>
-      </w:r>
-      <w:r>
-        <w:rPr>
-          <w:rFonts w:ascii="Courier New" w:eastAsia="Times New Roman" w:hAnsi="Courier New" w:cs="Courier New"/>
-          <w:color w:val="9CDCFE"/>
-          <w:sz w:val="18"/>
-          <w:szCs w:val="18"/>
-        </w:rPr>
-        <w:t>"email"</w:t>
-      </w:r>
-      <w:r>
-        <w:rPr>
-          <w:rFonts w:ascii="Courier New" w:eastAsia="Times New Roman" w:hAnsi="Courier New" w:cs="Courier New"/>
-          <w:color w:val="DCDCDC"/>
-          <w:sz w:val="18"/>
-          <w:szCs w:val="18"/>
-        </w:rPr>
-        <w:t>:</w:t>
-      </w:r>
-      <w:r>
-        <w:rPr>
-          <w:rFonts w:ascii="Courier New" w:eastAsia="Times New Roman" w:hAnsi="Courier New" w:cs="Courier New"/>
-          <w:color w:val="F8F8F2"/>
-          <w:sz w:val="18"/>
-          <w:szCs w:val="18"/>
-        </w:rPr>
-        <w:t xml:space="preserve"> </w:t>
-      </w:r>
-      <w:r>
-        <w:rPr>
-          <w:rFonts w:ascii="Courier New" w:eastAsia="Times New Roman" w:hAnsi="Courier New" w:cs="Courier New"/>
-          <w:color w:val="CE9178"/>
-          <w:sz w:val="18"/>
-          <w:szCs w:val="18"/>
-        </w:rPr>
-        <w:t>"vami@gmail.com"</w:t>
-      </w:r>
-      <w:r>
-        <w:rPr>
-          <w:rFonts w:ascii="Courier New" w:eastAsia="Times New Roman" w:hAnsi="Courier New" w:cs="Courier New"/>
-          <w:color w:val="DCDCDC"/>
-          <w:sz w:val="18"/>
-          <w:szCs w:val="18"/>
-        </w:rPr>
-        <w:t>,</w:t>
-      </w:r>
-    </w:p>
-    <w:p>
-      <w:pPr>
-        <w:shd w:val="clear" w:color="auto" w:fill="212121"/>
-        <w:spacing w:after="0" w:line="270" w:lineRule="atLeast"/>
-        <w:rPr>
-          <w:rFonts w:ascii="Courier New" w:eastAsia="Times New Roman" w:hAnsi="Courier New" w:cs="Courier New"/>
-          <w:color w:val="F8F8F2"/>
-          <w:sz w:val="18"/>
-          <w:szCs w:val="18"/>
-        </w:rPr>
-      </w:pPr>
-      <w:r>
-        <w:rPr>
-          <w:rFonts w:ascii="Courier New" w:eastAsia="Times New Roman" w:hAnsi="Courier New" w:cs="Courier New"/>
-          <w:color w:val="F8F8F2"/>
-          <w:sz w:val="18"/>
-          <w:szCs w:val="18"/>
-        </w:rPr>
-        <w:t xml:space="preserve">    </w:t>
-      </w:r>
-      <w:r>
-        <w:rPr>
-          <w:rFonts w:ascii="Courier New" w:eastAsia="Times New Roman" w:hAnsi="Courier New" w:cs="Courier New"/>
-          <w:color w:val="9CDCFE"/>
-          <w:sz w:val="18"/>
-          <w:szCs w:val="18"/>
-        </w:rPr>
-        <w:t>"password"</w:t>
-      </w:r>
-      <w:r>
-        <w:rPr>
-          <w:rFonts w:ascii="Courier New" w:eastAsia="Times New Roman" w:hAnsi="Courier New" w:cs="Courier New"/>
-          <w:color w:val="DCDCDC"/>
-          <w:sz w:val="18"/>
-          <w:szCs w:val="18"/>
-        </w:rPr>
-        <w:t>:</w:t>
-      </w:r>
-      <w:r>
-        <w:rPr>
-          <w:rFonts w:ascii="Courier New" w:eastAsia="Times New Roman" w:hAnsi="Courier New" w:cs="Courier New"/>
-          <w:color w:val="F8F8F2"/>
-          <w:sz w:val="18"/>
-          <w:szCs w:val="18"/>
-        </w:rPr>
-        <w:t xml:space="preserve"> </w:t>
-      </w:r>
-      <w:r>
-        <w:rPr>
-          <w:rFonts w:ascii="Courier New" w:eastAsia="Times New Roman" w:hAnsi="Courier New" w:cs="Courier New"/>
-          <w:color w:val="CE9178"/>
-          <w:sz w:val="18"/>
-          <w:szCs w:val="18"/>
-        </w:rPr>
-        <w:t>"myPass@001"</w:t>
-      </w:r>
-      <w:r>
-        <w:rPr>
-          <w:rFonts w:ascii="Courier New" w:eastAsia="Times New Roman" w:hAnsi="Courier New" w:cs="Courier New"/>
-          <w:color w:val="DCDCDC"/>
-          <w:sz w:val="18"/>
-          <w:szCs w:val="18"/>
-        </w:rPr>
-        <w:t>,</w:t>
-      </w:r>
-    </w:p>
-    <w:p>
-      <w:pPr>
-        <w:shd w:val="clear" w:color="auto" w:fill="212121"/>
-        <w:spacing w:after="0" w:line="270" w:lineRule="atLeast"/>
-        <w:rPr>
-          <w:rFonts w:ascii="Courier New" w:eastAsia="Times New Roman" w:hAnsi="Courier New" w:cs="Courier New"/>
-          <w:color w:val="F8F8F2"/>
-          <w:sz w:val="18"/>
-          <w:szCs w:val="18"/>
-        </w:rPr>
-      </w:pPr>
-      <w:r>
-        <w:rPr>
-          <w:rFonts w:ascii="Courier New" w:eastAsia="Times New Roman" w:hAnsi="Courier New" w:cs="Courier New"/>
-          <w:color w:val="F8F8F2"/>
-          <w:sz w:val="18"/>
-          <w:szCs w:val="18"/>
-        </w:rPr>
-        <w:t xml:space="preserve">    </w:t>
-      </w:r>
-      <w:r>
-        <w:rPr>
-          <w:rFonts w:ascii="Courier New" w:eastAsia="Times New Roman" w:hAnsi="Courier New" w:cs="Courier New"/>
-          <w:color w:val="9CDCFE"/>
-          <w:sz w:val="18"/>
-          <w:szCs w:val="18"/>
-        </w:rPr>
-        <w:t>"role"</w:t>
-      </w:r>
-      <w:r>
-        <w:rPr>
-          <w:rFonts w:ascii="Courier New" w:eastAsia="Times New Roman" w:hAnsi="Courier New" w:cs="Courier New"/>
-          <w:color w:val="DCDCDC"/>
-          <w:sz w:val="18"/>
-          <w:szCs w:val="18"/>
-        </w:rPr>
-        <w:t>:</w:t>
-      </w:r>
-      <w:r>
-        <w:rPr>
-          <w:rFonts w:ascii="Courier New" w:eastAsia="Times New Roman" w:hAnsi="Courier New" w:cs="Courier New"/>
-          <w:color w:val="F8F8F2"/>
-          <w:sz w:val="18"/>
-          <w:szCs w:val="18"/>
-        </w:rPr>
-        <w:t xml:space="preserve"> </w:t>
-      </w:r>
-      <w:r>
-        <w:rPr>
-          <w:rFonts w:ascii="Courier New" w:eastAsia="Times New Roman" w:hAnsi="Courier New" w:cs="Courier New"/>
-          <w:color w:val="CE9178"/>
-          <w:sz w:val="18"/>
-          <w:szCs w:val="18"/>
-        </w:rPr>
-        <w:t>"teacher"</w:t>
-      </w:r>
-      <w:r>
-        <w:rPr>
-          <w:rFonts w:ascii="Courier New" w:eastAsia="Times New Roman" w:hAnsi="Courier New" w:cs="Courier New"/>
-          <w:color w:val="DCDCDC"/>
-          <w:sz w:val="18"/>
-          <w:szCs w:val="18"/>
-        </w:rPr>
-        <w:t>,</w:t>
-      </w:r>
-    </w:p>
-    <w:p>
-      <w:pPr>
-        <w:shd w:val="clear" w:color="auto" w:fill="212121"/>
-        <w:spacing w:after="0" w:line="270" w:lineRule="atLeast"/>
-        <w:rPr>
-          <w:rFonts w:ascii="Courier New" w:eastAsia="Times New Roman" w:hAnsi="Courier New" w:cs="Courier New"/>
-          <w:color w:val="F8F8F2"/>
-          <w:sz w:val="18"/>
-          <w:szCs w:val="18"/>
-        </w:rPr>
-      </w:pPr>
-      <w:r>
-        <w:rPr>
-          <w:rFonts w:ascii="Courier New" w:eastAsia="Times New Roman" w:hAnsi="Courier New" w:cs="Courier New"/>
-          <w:color w:val="F8F8F2"/>
-          <w:sz w:val="18"/>
-          <w:szCs w:val="18"/>
-        </w:rPr>
-        <w:t xml:space="preserve">    </w:t>
-      </w:r>
-      <w:r>
-        <w:rPr>
-          <w:rFonts w:ascii="Courier New" w:eastAsia="Times New Roman" w:hAnsi="Courier New" w:cs="Courier New"/>
-          <w:color w:val="9CDCFE"/>
-          <w:sz w:val="18"/>
-          <w:szCs w:val="18"/>
-        </w:rPr>
-        <w:t>"nickname"</w:t>
-      </w:r>
-      <w:r>
-        <w:rPr>
-          <w:rFonts w:ascii="Courier New" w:eastAsia="Times New Roman" w:hAnsi="Courier New" w:cs="Courier New"/>
-          <w:color w:val="DCDCDC"/>
-          <w:sz w:val="18"/>
-          <w:szCs w:val="18"/>
-        </w:rPr>
-        <w:t>:</w:t>
-      </w:r>
-      <w:r>
-        <w:rPr>
-          <w:rFonts w:ascii="Courier New" w:eastAsia="Times New Roman" w:hAnsi="Courier New" w:cs="Courier New"/>
-          <w:color w:val="F8F8F2"/>
-          <w:sz w:val="18"/>
-          <w:szCs w:val="18"/>
-        </w:rPr>
-        <w:t xml:space="preserve"> </w:t>
-      </w:r>
-      <w:r>
-        <w:rPr>
-          <w:rFonts w:ascii="Courier New" w:eastAsia="Times New Roman" w:hAnsi="Courier New" w:cs="Courier New"/>
-          <w:color w:val="CE9178"/>
-          <w:sz w:val="18"/>
-          <w:szCs w:val="18"/>
-        </w:rPr>
-        <w:t>"</w:t>
-      </w:r>
-      <w:proofErr w:type="spellStart"/>
-      <w:r>
-        <w:rPr>
-          <w:rFonts w:ascii="Courier New" w:eastAsia="Times New Roman" w:hAnsi="Courier New" w:cs="Courier New"/>
-          <w:color w:val="CE9178"/>
-          <w:sz w:val="18"/>
-          <w:szCs w:val="18"/>
-        </w:rPr>
-        <w:t>vami</w:t>
-      </w:r>
-      <w:proofErr w:type="spellEnd"/>
-      <w:r>
-        <w:rPr>
-          <w:rFonts w:ascii="Courier New" w:eastAsia="Times New Roman" w:hAnsi="Courier New" w:cs="Courier New"/>
-          <w:color w:val="CE9178"/>
-          <w:sz w:val="18"/>
-          <w:szCs w:val="18"/>
-        </w:rPr>
-        <w:t>"</w:t>
-      </w:r>
-      <w:r>
-        <w:rPr>
-          <w:rFonts w:ascii="Courier New" w:eastAsia="Times New Roman" w:hAnsi="Courier New" w:cs="Courier New"/>
-          <w:color w:val="DCDCDC"/>
-          <w:sz w:val="18"/>
-          <w:szCs w:val="18"/>
-        </w:rPr>
-        <w:t>,</w:t>
-      </w:r>
-    </w:p>
-    <w:p>
-      <w:pPr>
-        <w:shd w:val="clear" w:color="auto" w:fill="212121"/>
-        <w:spacing w:after="0" w:line="270" w:lineRule="atLeast"/>
-        <w:rPr>
-          <w:rFonts w:ascii="Courier New" w:eastAsia="Times New Roman" w:hAnsi="Courier New" w:cs="Courier New"/>
-          <w:color w:val="F8F8F2"/>
-          <w:sz w:val="18"/>
-          <w:szCs w:val="18"/>
-        </w:rPr>
-      </w:pPr>
-      <w:r>
-        <w:rPr>
-          <w:rFonts w:ascii="Courier New" w:eastAsia="Times New Roman" w:hAnsi="Courier New" w:cs="Courier New"/>
-          <w:color w:val="F8F8F2"/>
-          <w:sz w:val="18"/>
-          <w:szCs w:val="18"/>
-        </w:rPr>
-        <w:t xml:space="preserve">    </w:t>
-      </w:r>
-      <w:r>
-        <w:rPr>
-          <w:rFonts w:ascii="Courier New" w:eastAsia="Times New Roman" w:hAnsi="Courier New" w:cs="Courier New"/>
-          <w:color w:val="9CDCFE"/>
-          <w:sz w:val="18"/>
-          <w:szCs w:val="18"/>
-        </w:rPr>
-        <w:t>"address"</w:t>
-      </w:r>
-      <w:r>
-        <w:rPr>
-          <w:rFonts w:ascii="Courier New" w:eastAsia="Times New Roman" w:hAnsi="Courier New" w:cs="Courier New"/>
-          <w:color w:val="DCDCDC"/>
-          <w:sz w:val="18"/>
-          <w:szCs w:val="18"/>
-        </w:rPr>
-        <w:t>:</w:t>
-      </w:r>
-      <w:r>
-        <w:rPr>
-          <w:rFonts w:ascii="Courier New" w:eastAsia="Times New Roman" w:hAnsi="Courier New" w:cs="Courier New"/>
-          <w:color w:val="F8F8F2"/>
-          <w:sz w:val="18"/>
-          <w:szCs w:val="18"/>
-        </w:rPr>
-        <w:t xml:space="preserve"> </w:t>
-      </w:r>
-      <w:r>
-        <w:rPr>
-          <w:rFonts w:ascii="Courier New" w:eastAsia="Times New Roman" w:hAnsi="Courier New" w:cs="Courier New"/>
-          <w:color w:val="CE9178"/>
-          <w:sz w:val="18"/>
-          <w:szCs w:val="18"/>
-        </w:rPr>
-        <w:t>"home"</w:t>
-      </w:r>
-      <w:r>
-        <w:rPr>
-          <w:rFonts w:ascii="Courier New" w:eastAsia="Times New Roman" w:hAnsi="Courier New" w:cs="Courier New"/>
-          <w:color w:val="DCDCDC"/>
-          <w:sz w:val="18"/>
-          <w:szCs w:val="18"/>
-        </w:rPr>
-        <w:t>,</w:t>
-      </w:r>
-    </w:p>
-    <w:p>
-      <w:pPr>
-        <w:shd w:val="clear" w:color="auto" w:fill="212121"/>
-        <w:spacing w:after="0" w:line="270" w:lineRule="atLeast"/>
-        <w:rPr>
-          <w:rFonts w:ascii="Courier New" w:eastAsia="Times New Roman" w:hAnsi="Courier New" w:cs="Courier New"/>
-          <w:color w:val="F8F8F2"/>
-          <w:sz w:val="18"/>
-          <w:szCs w:val="18"/>
-        </w:rPr>
-      </w:pPr>
-      <w:r>
-        <w:rPr>
-          <w:rFonts w:ascii="Courier New" w:eastAsia="Times New Roman" w:hAnsi="Courier New" w:cs="Courier New"/>
-          <w:color w:val="F8F8F2"/>
-          <w:sz w:val="18"/>
-          <w:szCs w:val="18"/>
-        </w:rPr>
-        <w:t xml:space="preserve">    </w:t>
-      </w:r>
-      <w:r>
-        <w:rPr>
-          <w:rFonts w:ascii="Courier New" w:eastAsia="Times New Roman" w:hAnsi="Courier New" w:cs="Courier New"/>
-          <w:color w:val="9CDCFE"/>
-          <w:sz w:val="18"/>
-          <w:szCs w:val="18"/>
-        </w:rPr>
-        <w:t>"</w:t>
-      </w:r>
-      <w:proofErr w:type="spellStart"/>
-      <w:r>
-        <w:rPr>
-          <w:rFonts w:ascii="Courier New" w:eastAsia="Times New Roman" w:hAnsi="Courier New" w:cs="Courier New"/>
-          <w:color w:val="9CDCFE"/>
-          <w:sz w:val="18"/>
-          <w:szCs w:val="18"/>
-        </w:rPr>
-        <w:t>date_of_birth</w:t>
-      </w:r>
-      <w:proofErr w:type="spellEnd"/>
-      <w:r>
-        <w:rPr>
-          <w:rFonts w:ascii="Courier New" w:eastAsia="Times New Roman" w:hAnsi="Courier New" w:cs="Courier New"/>
-          <w:color w:val="9CDCFE"/>
-          <w:sz w:val="18"/>
-          <w:szCs w:val="18"/>
-        </w:rPr>
-        <w:t>"</w:t>
-      </w:r>
-      <w:r>
-        <w:rPr>
-          <w:rFonts w:ascii="Courier New" w:eastAsia="Times New Roman" w:hAnsi="Courier New" w:cs="Courier New"/>
-          <w:color w:val="DCDCDC"/>
-          <w:sz w:val="18"/>
-          <w:szCs w:val="18"/>
-        </w:rPr>
-        <w:t>:</w:t>
-      </w:r>
-      <w:r>
-        <w:rPr>
-          <w:rFonts w:ascii="Courier New" w:eastAsia="Times New Roman" w:hAnsi="Courier New" w:cs="Courier New"/>
-          <w:color w:val="F8F8F2"/>
-          <w:sz w:val="18"/>
-          <w:szCs w:val="18"/>
-        </w:rPr>
-        <w:t xml:space="preserve"> </w:t>
-      </w:r>
-      <w:r>
-        <w:rPr>
-          <w:rFonts w:ascii="Courier New" w:eastAsia="Times New Roman" w:hAnsi="Courier New" w:cs="Courier New"/>
-          <w:color w:val="CE9178"/>
-          <w:sz w:val="18"/>
-          <w:szCs w:val="18"/>
-        </w:rPr>
-        <w:t>"2000-01-01"</w:t>
-      </w:r>
-      <w:r>
-        <w:rPr>
-          <w:rFonts w:ascii="Courier New" w:eastAsia="Times New Roman" w:hAnsi="Courier New" w:cs="Courier New"/>
-          <w:color w:val="DCDCDC"/>
-          <w:sz w:val="18"/>
-          <w:szCs w:val="18"/>
-        </w:rPr>
-        <w:t>,</w:t>
-      </w:r>
-    </w:p>
-    <w:p>
-      <w:pPr>
-        <w:shd w:val="clear" w:color="auto" w:fill="212121"/>
-        <w:spacing w:after="0" w:line="270" w:lineRule="atLeast"/>
-        <w:rPr>
-          <w:rFonts w:ascii="Courier New" w:eastAsia="Times New Roman" w:hAnsi="Courier New" w:cs="Courier New"/>
-          <w:color w:val="F8F8F2"/>
-          <w:sz w:val="18"/>
-          <w:szCs w:val="18"/>
-        </w:rPr>
-      </w:pPr>
-      <w:r>
-        <w:rPr>
-          <w:rFonts w:ascii="Courier New" w:eastAsia="Times New Roman" w:hAnsi="Courier New" w:cs="Courier New"/>
-          <w:color w:val="F8F8F2"/>
-          <w:sz w:val="18"/>
-          <w:szCs w:val="18"/>
-        </w:rPr>
-        <w:t xml:space="preserve">    </w:t>
-      </w:r>
-      <w:r>
-        <w:rPr>
-          <w:rFonts w:ascii="Courier New" w:eastAsia="Times New Roman" w:hAnsi="Courier New" w:cs="Courier New"/>
-          <w:color w:val="9CDCFE"/>
-          <w:sz w:val="18"/>
-          <w:szCs w:val="18"/>
-        </w:rPr>
-        <w:t>"full_name"</w:t>
-      </w:r>
-      <w:r>
-        <w:rPr>
-          <w:rFonts w:ascii="Courier New" w:eastAsia="Times New Roman" w:hAnsi="Courier New" w:cs="Courier New"/>
-          <w:color w:val="DCDCDC"/>
-          <w:sz w:val="18"/>
-          <w:szCs w:val="18"/>
-        </w:rPr>
-        <w:t>:</w:t>
-      </w:r>
-      <w:r>
-        <w:rPr>
-          <w:rFonts w:ascii="Courier New" w:eastAsia="Times New Roman" w:hAnsi="Courier New" w:cs="Courier New"/>
-          <w:color w:val="CE9178"/>
-          <w:sz w:val="18"/>
-          <w:szCs w:val="18"/>
-        </w:rPr>
-        <w:t>"</w:t>
-      </w:r>
-      <w:proofErr w:type="spellStart"/>
-      <w:r>
-        <w:rPr>
-          <w:rFonts w:ascii="Courier New" w:eastAsia="Times New Roman" w:hAnsi="Courier New" w:cs="Courier New"/>
-          <w:color w:val="CE9178"/>
-          <w:sz w:val="18"/>
-          <w:szCs w:val="18"/>
-        </w:rPr>
-        <w:t>Vami</w:t>
-      </w:r>
-      <w:proofErr w:type="spellEnd"/>
-      <w:r>
-        <w:rPr>
-          <w:rFonts w:ascii="Courier New" w:eastAsia="Times New Roman" w:hAnsi="Courier New" w:cs="Courier New"/>
-          <w:color w:val="CE9178"/>
-          <w:sz w:val="18"/>
-          <w:szCs w:val="18"/>
-        </w:rPr>
-        <w:t xml:space="preserve"> </w:t>
-      </w:r>
-      <w:proofErr w:type="spellStart"/>
-      <w:r>
-        <w:rPr>
-          <w:rFonts w:ascii="Courier New" w:eastAsia="Times New Roman" w:hAnsi="Courier New" w:cs="Courier New"/>
-          <w:color w:val="CE9178"/>
-          <w:sz w:val="18"/>
-          <w:szCs w:val="18"/>
-        </w:rPr>
-        <w:t>vami</w:t>
-      </w:r>
-      <w:proofErr w:type="spellEnd"/>
-      <w:r>
-        <w:rPr>
-          <w:rFonts w:ascii="Courier New" w:eastAsia="Times New Roman" w:hAnsi="Courier New" w:cs="Courier New"/>
-          <w:color w:val="CE9178"/>
-          <w:sz w:val="18"/>
-          <w:szCs w:val="18"/>
-        </w:rPr>
-        <w:t>"</w:t>
-      </w:r>
-    </w:p>
-    <w:p>
-      <w:pPr>
-        <w:shd w:val="clear" w:color="auto" w:fill="212121"/>
-        <w:spacing w:after="0" w:line="270" w:lineRule="atLeast"/>
-        <w:rPr>
-          <w:rFonts w:ascii="Courier New" w:eastAsia="Times New Roman" w:hAnsi="Courier New" w:cs="Courier New"/>
-          <w:color w:val="F8F8F2"/>
-          <w:sz w:val="18"/>
-          <w:szCs w:val="18"/>
-        </w:rPr>
-      </w:pPr>
-      <w:r>
-        <w:rPr>
-          <w:rFonts w:ascii="Courier New" w:eastAsia="Times New Roman" w:hAnsi="Courier New" w:cs="Courier New"/>
-          <w:color w:val="DCDCDC"/>
-          <w:sz w:val="18"/>
-          <w:szCs w:val="18"/>
-        </w:rPr>
-        <w:t>}</w:t>
-      </w:r>
-    </w:p>
-    <w:p>
-      <w:pPr>
-        <w:pStyle w:val="Listaszerbekezds"/>
-        <w:numPr>
-          <w:ilvl w:val="0"/>
-          <w:numId w:val="5"/>
-        </w:numPr>
-        <w:rPr>
-          <w:rFonts w:ascii="Times New Roman" w:hAnsi="Times New Roman" w:cs="Times New Roman"/>
-          <w:color w:val="FF0000"/>
-          <w:sz w:val="28"/>
-          <w:szCs w:val="28"/>
-        </w:rPr>
-      </w:pPr>
-      <w:r>
-        <w:rPr>
-          <w:rFonts w:ascii="Times New Roman" w:hAnsi="Times New Roman" w:cs="Times New Roman"/>
-          <w:sz w:val="28"/>
-          <w:szCs w:val="28"/>
-        </w:rPr>
-        <w:t>Login:</w:t>
-      </w:r>
-    </w:p>
-    <w:p>
-      <w:pPr>
-        <w:pStyle w:val="Listaszerbekezds"/>
-        <w:numPr>
-          <w:ilvl w:val="1"/>
-          <w:numId w:val="5"/>
-        </w:numPr>
-        <w:rPr>
-          <w:rFonts w:ascii="Times New Roman" w:hAnsi="Times New Roman" w:cs="Times New Roman"/>
-          <w:color w:val="FF0000"/>
-          <w:sz w:val="28"/>
-          <w:szCs w:val="28"/>
-        </w:rPr>
-      </w:pPr>
-      <w:r>
-        <w:rPr>
-          <w:rFonts w:ascii="Times New Roman" w:hAnsi="Times New Roman" w:cs="Times New Roman"/>
-          <w:sz w:val="28"/>
-          <w:szCs w:val="28"/>
-        </w:rPr>
-        <w:t>End point: /login</w:t>
-      </w:r>
-    </w:p>
-    <w:p>
-      <w:pPr>
-        <w:pStyle w:val="Listaszerbekezds"/>
-        <w:numPr>
-          <w:ilvl w:val="1"/>
-          <w:numId w:val="5"/>
-        </w:numPr>
-        <w:rPr>
-          <w:rFonts w:ascii="Times New Roman" w:hAnsi="Times New Roman" w:cs="Times New Roman"/>
-          <w:color w:val="FF0000"/>
-          <w:sz w:val="28"/>
-          <w:szCs w:val="28"/>
-        </w:rPr>
-      </w:pPr>
-      <w:r>
-        <w:rPr>
-          <w:rFonts w:ascii="Times New Roman" w:hAnsi="Times New Roman" w:cs="Times New Roman"/>
-          <w:sz w:val="28"/>
-          <w:szCs w:val="28"/>
-        </w:rPr>
-        <w:t>Method: POST</w:t>
-      </w:r>
-    </w:p>
-    <w:p>
-      <w:pPr>
-        <w:shd w:val="clear" w:color="auto" w:fill="212121"/>
-        <w:spacing w:line="270" w:lineRule="atLeast"/>
-        <w:rPr>
-          <w:rFonts w:ascii="Courier New" w:eastAsia="Times New Roman" w:hAnsi="Courier New" w:cs="Courier New"/>
-          <w:color w:val="F8F8F2"/>
-          <w:sz w:val="18"/>
-          <w:szCs w:val="18"/>
-        </w:rPr>
-      </w:pPr>
-      <w:r>
-        <w:rPr>
-          <w:rFonts w:ascii="Times New Roman" w:hAnsi="Times New Roman" w:cs="Times New Roman"/>
-          <w:sz w:val="28"/>
-          <w:szCs w:val="28"/>
-        </w:rPr>
-        <w:t>Body.</w:t>
-      </w:r>
-      <w:r>
-        <w:rPr>
-          <w:rFonts w:ascii="Courier New" w:hAnsi="Courier New" w:cs="Courier New"/>
-          <w:color w:val="DCDCDC"/>
-          <w:sz w:val="18"/>
-          <w:szCs w:val="18"/>
-        </w:rPr>
-        <w:t xml:space="preserve"> </w:t>
-      </w:r>
-      <w:r>
-        <w:rPr>
-          <w:rFonts w:ascii="Courier New" w:eastAsia="Times New Roman" w:hAnsi="Courier New" w:cs="Courier New"/>
-          <w:color w:val="DCDCDC"/>
-          <w:sz w:val="18"/>
-          <w:szCs w:val="18"/>
-        </w:rPr>
-        <w:t>{</w:t>
-      </w:r>
-    </w:p>
-    <w:p>
-      <w:pPr>
-        <w:shd w:val="clear" w:color="auto" w:fill="212121"/>
-        <w:spacing w:after="0" w:line="270" w:lineRule="atLeast"/>
-        <w:rPr>
-          <w:rFonts w:ascii="Courier New" w:eastAsia="Times New Roman" w:hAnsi="Courier New" w:cs="Courier New"/>
-          <w:color w:val="F8F8F2"/>
-          <w:sz w:val="18"/>
-          <w:szCs w:val="18"/>
-        </w:rPr>
-      </w:pPr>
-      <w:r>
-        <w:rPr>
-          <w:rFonts w:ascii="Courier New" w:eastAsia="Times New Roman" w:hAnsi="Courier New" w:cs="Courier New"/>
-          <w:color w:val="F8F8F2"/>
-          <w:sz w:val="18"/>
-          <w:szCs w:val="18"/>
-        </w:rPr>
-        <w:t xml:space="preserve">    </w:t>
-      </w:r>
-      <w:r>
-        <w:rPr>
-          <w:rFonts w:ascii="Courier New" w:eastAsia="Times New Roman" w:hAnsi="Courier New" w:cs="Courier New"/>
-          <w:color w:val="9CDCFE"/>
-          <w:sz w:val="18"/>
-          <w:szCs w:val="18"/>
-        </w:rPr>
-        <w:t>"email"</w:t>
-      </w:r>
-      <w:r>
-        <w:rPr>
-          <w:rFonts w:ascii="Courier New" w:eastAsia="Times New Roman" w:hAnsi="Courier New" w:cs="Courier New"/>
-          <w:color w:val="DCDCDC"/>
-          <w:sz w:val="18"/>
-          <w:szCs w:val="18"/>
-        </w:rPr>
-        <w:t>:</w:t>
-      </w:r>
-      <w:r>
-        <w:rPr>
-          <w:rFonts w:ascii="Courier New" w:eastAsia="Times New Roman" w:hAnsi="Courier New" w:cs="Courier New"/>
-          <w:color w:val="CE9178"/>
-          <w:sz w:val="18"/>
-          <w:szCs w:val="18"/>
-        </w:rPr>
-        <w:t>"vami@gmail.com"</w:t>
-      </w:r>
-      <w:r>
-        <w:rPr>
-          <w:rFonts w:ascii="Courier New" w:eastAsia="Times New Roman" w:hAnsi="Courier New" w:cs="Courier New"/>
-          <w:color w:val="DCDCDC"/>
-          <w:sz w:val="18"/>
-          <w:szCs w:val="18"/>
-        </w:rPr>
-        <w:t>,</w:t>
-      </w:r>
-    </w:p>
-    <w:p>
-      <w:pPr>
-        <w:shd w:val="clear" w:color="auto" w:fill="212121"/>
-        <w:spacing w:after="0" w:line="270" w:lineRule="atLeast"/>
-        <w:rPr>
-          <w:rFonts w:ascii="Courier New" w:eastAsia="Times New Roman" w:hAnsi="Courier New" w:cs="Courier New"/>
-          <w:color w:val="F8F8F2"/>
-          <w:sz w:val="18"/>
-          <w:szCs w:val="18"/>
-        </w:rPr>
-      </w:pPr>
-      <w:r>
-        <w:rPr>
-          <w:rFonts w:ascii="Courier New" w:eastAsia="Times New Roman" w:hAnsi="Courier New" w:cs="Courier New"/>
-          <w:color w:val="F8F8F2"/>
-          <w:sz w:val="18"/>
-          <w:szCs w:val="18"/>
-        </w:rPr>
-        <w:t xml:space="preserve">    </w:t>
-      </w:r>
-      <w:r>
-        <w:rPr>
-          <w:rFonts w:ascii="Courier New" w:eastAsia="Times New Roman" w:hAnsi="Courier New" w:cs="Courier New"/>
-          <w:color w:val="9CDCFE"/>
-          <w:sz w:val="18"/>
-          <w:szCs w:val="18"/>
-        </w:rPr>
-        <w:t>"password"</w:t>
-      </w:r>
-      <w:r>
-        <w:rPr>
-          <w:rFonts w:ascii="Courier New" w:eastAsia="Times New Roman" w:hAnsi="Courier New" w:cs="Courier New"/>
-          <w:color w:val="DCDCDC"/>
-          <w:sz w:val="18"/>
-          <w:szCs w:val="18"/>
-        </w:rPr>
-        <w:t>:</w:t>
-      </w:r>
-      <w:r>
-        <w:rPr>
-          <w:rFonts w:ascii="Courier New" w:eastAsia="Times New Roman" w:hAnsi="Courier New" w:cs="Courier New"/>
-          <w:color w:val="CE9178"/>
-          <w:sz w:val="18"/>
-          <w:szCs w:val="18"/>
-        </w:rPr>
-        <w:t>"myPass@001"</w:t>
-      </w:r>
-    </w:p>
-    <w:p>
-      <w:pPr>
-        <w:shd w:val="clear" w:color="auto" w:fill="212121"/>
-        <w:spacing w:after="0" w:line="270" w:lineRule="atLeast"/>
-        <w:rPr>
-          <w:rFonts w:ascii="Courier New" w:eastAsia="Times New Roman" w:hAnsi="Courier New" w:cs="Courier New"/>
-          <w:color w:val="F8F8F2"/>
-          <w:sz w:val="18"/>
-          <w:szCs w:val="18"/>
-        </w:rPr>
-      </w:pPr>
-      <w:r>
-        <w:rPr>
-          <w:rFonts w:ascii="Courier New" w:eastAsia="Times New Roman" w:hAnsi="Courier New" w:cs="Courier New"/>
-          <w:color w:val="DCDCDC"/>
-          <w:sz w:val="18"/>
-          <w:szCs w:val="18"/>
-        </w:rPr>
-        <w:t>}</w:t>
-      </w:r>
-    </w:p>
-    <w:p>
-      <w:pPr>
-        <w:pStyle w:val="Listaszerbekezds"/>
-        <w:numPr>
-          <w:ilvl w:val="0"/>
-          <w:numId w:val="5"/>
-        </w:numPr>
-        <w:rPr>
-          <w:rFonts w:ascii="Times New Roman" w:hAnsi="Times New Roman" w:cs="Times New Roman"/>
-          <w:color w:val="FF0000"/>
-          <w:sz w:val="28"/>
-          <w:szCs w:val="28"/>
-        </w:rPr>
-      </w:pPr>
-      <w:r>
-        <w:rPr>
-          <w:rFonts w:ascii="Times New Roman" w:hAnsi="Times New Roman" w:cs="Times New Roman"/>
-          <w:sz w:val="28"/>
-          <w:szCs w:val="28"/>
-        </w:rPr>
-        <w:t>Refresh:</w:t>
-      </w:r>
-    </w:p>
-    <w:p>
-      <w:pPr>
-        <w:pStyle w:val="Listaszerbekezds"/>
-        <w:numPr>
-          <w:ilvl w:val="1"/>
-          <w:numId w:val="5"/>
-        </w:numPr>
-        <w:rPr>
-          <w:rFonts w:ascii="Times New Roman" w:hAnsi="Times New Roman" w:cs="Times New Roman"/>
-          <w:color w:val="FF0000"/>
-          <w:sz w:val="28"/>
-          <w:szCs w:val="28"/>
-        </w:rPr>
-      </w:pPr>
-      <w:r>
-        <w:rPr>
-          <w:rFonts w:ascii="Times New Roman" w:hAnsi="Times New Roman" w:cs="Times New Roman"/>
-          <w:sz w:val="28"/>
-          <w:szCs w:val="28"/>
-        </w:rPr>
-        <w:t>End point: /refresh</w:t>
-      </w:r>
-    </w:p>
-    <w:p>
-      <w:pPr>
-        <w:pStyle w:val="Listaszerbekezds"/>
-        <w:numPr>
-          <w:ilvl w:val="1"/>
-          <w:numId w:val="5"/>
-        </w:numPr>
-        <w:rPr>
-          <w:rFonts w:ascii="Times New Roman" w:hAnsi="Times New Roman" w:cs="Times New Roman"/>
-          <w:color w:val="FF0000"/>
-          <w:sz w:val="28"/>
-          <w:szCs w:val="28"/>
-        </w:rPr>
-      </w:pPr>
-      <w:r>
-        <w:rPr>
-          <w:rFonts w:ascii="Times New Roman" w:hAnsi="Times New Roman" w:cs="Times New Roman"/>
-          <w:sz w:val="28"/>
-          <w:szCs w:val="28"/>
-        </w:rPr>
-        <w:t>Method: GET</w:t>
-      </w:r>
-    </w:p>
-    <w:p>
-      <w:pPr>
-        <w:pStyle w:val="Listaszerbekezds"/>
-        <w:numPr>
-          <w:ilvl w:val="0"/>
-          <w:numId w:val="5"/>
-        </w:numPr>
-        <w:rPr>
-          <w:rFonts w:ascii="Times New Roman" w:hAnsi="Times New Roman" w:cs="Times New Roman"/>
-          <w:color w:val="FF0000"/>
-          <w:sz w:val="28"/>
-          <w:szCs w:val="28"/>
-        </w:rPr>
-      </w:pPr>
-      <w:r>
-        <w:rPr>
-          <w:rFonts w:ascii="Times New Roman" w:hAnsi="Times New Roman" w:cs="Times New Roman"/>
-          <w:sz w:val="28"/>
-          <w:szCs w:val="28"/>
-        </w:rPr>
-        <w:t>Log out:</w:t>
-      </w:r>
-    </w:p>
-    <w:p>
-      <w:pPr>
-        <w:pStyle w:val="Listaszerbekezds"/>
-        <w:numPr>
-          <w:ilvl w:val="1"/>
-          <w:numId w:val="5"/>
-        </w:numPr>
-        <w:rPr>
-          <w:rFonts w:ascii="Times New Roman" w:hAnsi="Times New Roman" w:cs="Times New Roman"/>
-          <w:color w:val="FF0000"/>
-          <w:sz w:val="28"/>
-          <w:szCs w:val="28"/>
-        </w:rPr>
-      </w:pPr>
-      <w:r>
-        <w:rPr>
-          <w:rFonts w:ascii="Times New Roman" w:hAnsi="Times New Roman" w:cs="Times New Roman"/>
-          <w:sz w:val="28"/>
-          <w:szCs w:val="28"/>
-        </w:rPr>
-        <w:t>End point: /logout</w:t>
-      </w:r>
-    </w:p>
-    <w:p>
-      <w:pPr>
-        <w:pStyle w:val="Listaszerbekezds"/>
-        <w:numPr>
-          <w:ilvl w:val="1"/>
-          <w:numId w:val="5"/>
-        </w:numPr>
-        <w:rPr>
-          <w:rFonts w:ascii="Times New Roman" w:hAnsi="Times New Roman" w:cs="Times New Roman"/>
-          <w:color w:val="FF0000"/>
-          <w:sz w:val="28"/>
-          <w:szCs w:val="28"/>
-        </w:rPr>
-      </w:pPr>
-      <w:r>
-        <w:rPr>
-          <w:rFonts w:ascii="Times New Roman" w:hAnsi="Times New Roman" w:cs="Times New Roman"/>
-          <w:sz w:val="28"/>
-          <w:szCs w:val="28"/>
-        </w:rPr>
-        <w:lastRenderedPageBreak/>
-        <w:t>Method: GET</w:t>
+      <w:r>
+        <w:rPr>
+          <w:rFonts w:ascii="Times New Roman" w:hAnsi="Times New Roman" w:cs="Times New Roman"/>
+          <w:color w:val="000000" w:themeColor="text1"/>
+          <w:sz w:val="28"/>
+          <w:szCs w:val="28"/>
+        </w:rPr>
+        <w:t>”]</w:t>
       </w:r>
     </w:p>
     <w:sectPr>
@@ -1395,6 +2337,119 @@
 <file path=word/numbering.xml><?xml version="1.0" encoding="utf-8"?>
 <w:numbering xmlns:wpc="http://schemas.microsoft.com/office/word/2010/wordprocessingCanvas" xmlns:cx="http://schemas.microsoft.com/office/drawing/2014/chartex" xmlns:mc="http://schemas.openxmlformats.org/markup-compatibility/2006" xmlns:o="urn:schemas-microsoft-com:office:office" xmlns:r="http://schemas.openxmlformats.org/officeDocument/2006/relationships" xmlns:m="http://schemas.openxmlformats.org/officeDocument/2006/math" xmlns:v="urn:schemas-microsoft-com:vml" xmlns:wp14="http://schemas.microsoft.com/office/word/2010/wordprocessingDrawing" xmlns:wp="http://schemas.openxmlformats.org/drawingml/2006/wordprocessingDrawing" xmlns:w10="urn:schemas-microsoft-com:office:word" xmlns:w="http://schemas.openxmlformats.org/wordprocessingml/2006/main" xmlns:w14="http://schemas.microsoft.com/office/word/2010/wordml" xmlns:w15="http://schemas.microsoft.com/office/word/2012/wordml" xmlns:w16se="http://schemas.microsoft.com/office/word/2015/wordml/symex" xmlns:wpg="http://schemas.microsoft.com/office/word/2010/wordprocessingGroup" xmlns:wpi="http://schemas.microsoft.com/office/word/2010/wordprocessingInk" xmlns:wne="http://schemas.microsoft.com/office/word/2006/wordml" xmlns:wps="http://schemas.microsoft.com/office/word/2010/wordprocessingShape" mc:Ignorable="w14 w15 w16se wp14">
   <w:abstractNum w:abstractNumId="0" w15:restartNumberingAfterBreak="0">
+    <w:nsid w:val="15A17770"/>
+    <w:multiLevelType w:val="multilevel"/>
+    <w:tmpl w:val="04090021"/>
+    <w:lvl w:ilvl="0">
+      <w:start w:val="1"/>
+      <w:numFmt w:val="bullet"/>
+      <w:lvlText w:val=""/>
+      <w:lvlJc w:val="left"/>
+      <w:pPr>
+        <w:ind w:left="1080" w:hanging="360"/>
+      </w:pPr>
+      <w:rPr>
+        <w:rFonts w:ascii="Wingdings" w:hAnsi="Wingdings" w:hint="default"/>
+      </w:rPr>
+    </w:lvl>
+    <w:lvl w:ilvl="1">
+      <w:start w:val="1"/>
+      <w:numFmt w:val="bullet"/>
+      <w:lvlText w:val=""/>
+      <w:lvlJc w:val="left"/>
+      <w:pPr>
+        <w:ind w:left="1440" w:hanging="360"/>
+      </w:pPr>
+      <w:rPr>
+        <w:rFonts w:ascii="Wingdings" w:hAnsi="Wingdings" w:hint="default"/>
+      </w:rPr>
+    </w:lvl>
+    <w:lvl w:ilvl="2">
+      <w:start w:val="1"/>
+      <w:numFmt w:val="bullet"/>
+      <w:lvlText w:val=""/>
+      <w:lvlJc w:val="left"/>
+      <w:pPr>
+        <w:ind w:left="1800" w:hanging="360"/>
+      </w:pPr>
+      <w:rPr>
+        <w:rFonts w:ascii="Wingdings" w:hAnsi="Wingdings" w:hint="default"/>
+      </w:rPr>
+    </w:lvl>
+    <w:lvl w:ilvl="3">
+      <w:start w:val="1"/>
+      <w:numFmt w:val="bullet"/>
+      <w:lvlText w:val=""/>
+      <w:lvlJc w:val="left"/>
+      <w:pPr>
+        <w:ind w:left="2160" w:hanging="360"/>
+      </w:pPr>
+      <w:rPr>
+        <w:rFonts w:ascii="Symbol" w:hAnsi="Symbol" w:hint="default"/>
+      </w:rPr>
+    </w:lvl>
+    <w:lvl w:ilvl="4">
+      <w:start w:val="1"/>
+      <w:numFmt w:val="bullet"/>
+      <w:lvlText w:val=""/>
+      <w:lvlJc w:val="left"/>
+      <w:pPr>
+        <w:ind w:left="2520" w:hanging="360"/>
+      </w:pPr>
+      <w:rPr>
+        <w:rFonts w:ascii="Symbol" w:hAnsi="Symbol" w:hint="default"/>
+      </w:rPr>
+    </w:lvl>
+    <w:lvl w:ilvl="5">
+      <w:start w:val="1"/>
+      <w:numFmt w:val="bullet"/>
+      <w:lvlText w:val=""/>
+      <w:lvlJc w:val="left"/>
+      <w:pPr>
+        <w:ind w:left="2880" w:hanging="360"/>
+      </w:pPr>
+      <w:rPr>
+        <w:rFonts w:ascii="Wingdings" w:hAnsi="Wingdings" w:hint="default"/>
+      </w:rPr>
+    </w:lvl>
+    <w:lvl w:ilvl="6">
+      <w:start w:val="1"/>
+      <w:numFmt w:val="bullet"/>
+      <w:lvlText w:val=""/>
+      <w:lvlJc w:val="left"/>
+      <w:pPr>
+        <w:ind w:left="3240" w:hanging="360"/>
+      </w:pPr>
+      <w:rPr>
+        <w:rFonts w:ascii="Wingdings" w:hAnsi="Wingdings" w:hint="default"/>
+      </w:rPr>
+    </w:lvl>
+    <w:lvl w:ilvl="7">
+      <w:start w:val="1"/>
+      <w:numFmt w:val="bullet"/>
+      <w:lvlText w:val=""/>
+      <w:lvlJc w:val="left"/>
+      <w:pPr>
+        <w:ind w:left="3600" w:hanging="360"/>
+      </w:pPr>
+      <w:rPr>
+        <w:rFonts w:ascii="Symbol" w:hAnsi="Symbol" w:hint="default"/>
+      </w:rPr>
+    </w:lvl>
+    <w:lvl w:ilvl="8">
+      <w:start w:val="1"/>
+      <w:numFmt w:val="bullet"/>
+      <w:lvlText w:val=""/>
+      <w:lvlJc w:val="left"/>
+      <w:pPr>
+        <w:ind w:left="3960" w:hanging="360"/>
+      </w:pPr>
+      <w:rPr>
+        <w:rFonts w:ascii="Symbol" w:hAnsi="Symbol" w:hint="default"/>
+      </w:rPr>
+    </w:lvl>
+  </w:abstractNum>
+  <w:abstractNum w:abstractNumId="1" w15:restartNumberingAfterBreak="0">
     <w:nsid w:val="216B48EE"/>
     <w:multiLevelType w:val="multilevel"/>
     <w:tmpl w:val="04090021"/>
@@ -1507,7 +2562,7 @@
       </w:rPr>
     </w:lvl>
   </w:abstractNum>
-  <w:abstractNum w:abstractNumId="1" w15:restartNumberingAfterBreak="0">
+  <w:abstractNum w:abstractNumId="2" w15:restartNumberingAfterBreak="0">
     <w:nsid w:val="32F47A3D"/>
     <w:multiLevelType w:val="multilevel"/>
     <w:tmpl w:val="04090021"/>
@@ -1620,7 +2675,7 @@
       </w:rPr>
     </w:lvl>
   </w:abstractNum>
-  <w:abstractNum w:abstractNumId="2" w15:restartNumberingAfterBreak="0">
+  <w:abstractNum w:abstractNumId="3" w15:restartNumberingAfterBreak="0">
     <w:nsid w:val="3D76092D"/>
     <w:multiLevelType w:val="hybridMultilevel"/>
     <w:tmpl w:val="F8D49F6C"/>
@@ -1733,7 +2788,7 @@
       </w:rPr>
     </w:lvl>
   </w:abstractNum>
-  <w:abstractNum w:abstractNumId="3" w15:restartNumberingAfterBreak="0">
+  <w:abstractNum w:abstractNumId="4" w15:restartNumberingAfterBreak="0">
     <w:nsid w:val="45FC2026"/>
     <w:multiLevelType w:val="multilevel"/>
     <w:tmpl w:val="04090021"/>
@@ -1846,7 +2901,7 @@
       </w:rPr>
     </w:lvl>
   </w:abstractNum>
-  <w:abstractNum w:abstractNumId="4" w15:restartNumberingAfterBreak="0">
+  <w:abstractNum w:abstractNumId="5" w15:restartNumberingAfterBreak="0">
     <w:nsid w:val="6AC963A3"/>
     <w:multiLevelType w:val="multilevel"/>
     <w:tmpl w:val="04090021"/>
@@ -1960,18 +3015,21 @@
     </w:lvl>
   </w:abstractNum>
   <w:num w:numId="1">
+    <w:abstractNumId w:val="3"/>
+  </w:num>
+  <w:num w:numId="2">
     <w:abstractNumId w:val="2"/>
   </w:num>
-  <w:num w:numId="2">
+  <w:num w:numId="3">
+    <w:abstractNumId w:val="5"/>
+  </w:num>
+  <w:num w:numId="4">
+    <w:abstractNumId w:val="4"/>
+  </w:num>
+  <w:num w:numId="5">
     <w:abstractNumId w:val="1"/>
   </w:num>
-  <w:num w:numId="3">
-    <w:abstractNumId w:val="4"/>
-  </w:num>
-  <w:num w:numId="4">
-    <w:abstractNumId w:val="3"/>
-  </w:num>
-  <w:num w:numId="5">
+  <w:num w:numId="6">
     <w:abstractNumId w:val="0"/>
   </w:num>
 </w:numbering>

</xml_diff>

<commit_message>
backend - preferences end points
</commit_message>
<xml_diff>
--- a/Dev docs/Backend Docs.docx
+++ b/Dev docs/Backend Docs.docx
@@ -1552,6 +1552,8 @@
         </w:rPr>
         <w:t>point: /logout</w:t>
       </w:r>
+      <w:bookmarkStart w:id="0" w:name="_GoBack"/>
+      <w:bookmarkEnd w:id="0"/>
     </w:p>
     <w:p>
       <w:pPr>
@@ -1622,6 +1624,96 @@
     </w:p>
     <w:p>
       <w:pPr>
+        <w:pStyle w:val="Listaszerbekezds"/>
+        <w:numPr>
+          <w:ilvl w:val="0"/>
+          <w:numId w:val="5"/>
+        </w:numPr>
+        <w:rPr>
+          <w:rFonts w:ascii="Times New Roman" w:hAnsi="Times New Roman" w:cs="Times New Roman"/>
+          <w:color w:val="000000" w:themeColor="text1"/>
+          <w:sz w:val="24"/>
+          <w:szCs w:val="24"/>
+        </w:rPr>
+      </w:pPr>
+      <w:r>
+        <w:rPr>
+          <w:rFonts w:ascii="Times New Roman" w:hAnsi="Times New Roman" w:cs="Times New Roman"/>
+          <w:color w:val="000000" w:themeColor="text1"/>
+          <w:sz w:val="28"/>
+          <w:szCs w:val="28"/>
+        </w:rPr>
+        <w:t>Forget password:</w:t>
+      </w:r>
+    </w:p>
+    <w:p>
+      <w:pPr>
+        <w:pStyle w:val="Listaszerbekezds"/>
+        <w:numPr>
+          <w:ilvl w:val="1"/>
+          <w:numId w:val="5"/>
+        </w:numPr>
+        <w:rPr>
+          <w:rFonts w:ascii="Times New Roman" w:hAnsi="Times New Roman" w:cs="Times New Roman"/>
+          <w:color w:val="000000" w:themeColor="text1"/>
+          <w:sz w:val="24"/>
+          <w:szCs w:val="24"/>
+        </w:rPr>
+      </w:pPr>
+      <w:proofErr w:type="spellStart"/>
+      <w:r>
+        <w:rPr>
+          <w:rFonts w:ascii="Times New Roman" w:hAnsi="Times New Roman" w:cs="Times New Roman"/>
+          <w:color w:val="000000" w:themeColor="text1"/>
+          <w:sz w:val="24"/>
+          <w:szCs w:val="24"/>
+        </w:rPr>
+        <w:t>docker</w:t>
+      </w:r>
+      <w:proofErr w:type="spellEnd"/>
+      <w:r>
+        <w:rPr>
+          <w:rFonts w:ascii="Times New Roman" w:hAnsi="Times New Roman" w:cs="Times New Roman"/>
+          <w:color w:val="000000" w:themeColor="text1"/>
+          <w:sz w:val="24"/>
+          <w:szCs w:val="24"/>
+        </w:rPr>
+        <w:t xml:space="preserve"> run -d -p 1025:1025 -p 8025:8025 </w:t>
+      </w:r>
+      <w:proofErr w:type="spellStart"/>
+      <w:r>
+        <w:rPr>
+          <w:rFonts w:ascii="Times New Roman" w:hAnsi="Times New Roman" w:cs="Times New Roman"/>
+          <w:color w:val="000000" w:themeColor="text1"/>
+          <w:sz w:val="24"/>
+          <w:szCs w:val="24"/>
+        </w:rPr>
+        <w:t>mailhog</w:t>
+      </w:r>
+      <w:proofErr w:type="spellEnd"/>
+      <w:r>
+        <w:rPr>
+          <w:rFonts w:ascii="Times New Roman" w:hAnsi="Times New Roman" w:cs="Times New Roman"/>
+          <w:color w:val="000000" w:themeColor="text1"/>
+          <w:sz w:val="24"/>
+          <w:szCs w:val="24"/>
+        </w:rPr>
+        <w:t>/</w:t>
+      </w:r>
+      <w:proofErr w:type="spellStart"/>
+      <w:r>
+        <w:rPr>
+          <w:rFonts w:ascii="Times New Roman" w:hAnsi="Times New Roman" w:cs="Times New Roman"/>
+          <w:color w:val="000000" w:themeColor="text1"/>
+          <w:sz w:val="24"/>
+          <w:szCs w:val="24"/>
+        </w:rPr>
+        <w:t>mailhog</w:t>
+      </w:r>
+      <w:proofErr w:type="spellEnd"/>
+    </w:p>
+    <w:p>
+      <w:pPr>
         <w:rPr>
           <w:rFonts w:ascii="Times New Roman" w:hAnsi="Times New Roman" w:cs="Times New Roman"/>
           <w:color w:val="000000" w:themeColor="text1"/>
@@ -2310,18 +2402,7 @@
           <w:sz w:val="28"/>
           <w:szCs w:val="28"/>
         </w:rPr>
-        <w:t>Body: [“0001”, “0002</w:t>
-      </w:r>
-      <w:bookmarkStart w:id="0" w:name="_GoBack"/>
-      <w:bookmarkEnd w:id="0"/>
-      <w:r>
-        <w:rPr>
-          <w:rFonts w:ascii="Times New Roman" w:hAnsi="Times New Roman" w:cs="Times New Roman"/>
-          <w:color w:val="000000" w:themeColor="text1"/>
-          <w:sz w:val="28"/>
-          <w:szCs w:val="28"/>
-        </w:rPr>
-        <w:t>”]</w:t>
+        <w:t>Body: [“0001”, “0002”]</w:t>
       </w:r>
     </w:p>
     <w:sectPr>

</xml_diff>